<commit_message>
Docs: updated rag sheet with vector database decision matrix
</commit_message>
<xml_diff>
--- a/rag - cheet_sheet.docx
+++ b/rag - cheet_sheet.docx
@@ -406,8 +406,13 @@
           <w:numId w:val="6"/>
         </w:numPr>
       </w:pPr>
-      <w:r>
-        <w:t xml:space="preserve">LlamaIndex </w:t>
+      <w:proofErr w:type="spellStart"/>
+      <w:r>
+        <w:t>LlamaIndex</w:t>
+      </w:r>
+      <w:proofErr w:type="spellEnd"/>
+      <w:r>
+        <w:t xml:space="preserve"> </w:t>
       </w:r>
       <w:proofErr w:type="spellStart"/>
       <w:r>
@@ -1414,28 +1419,2393 @@
         <w:t xml:space="preserve"> └ disk-optimized vector layout</w:t>
       </w:r>
     </w:p>
+    <w:p>
+      <w:pPr>
+        <w:ind w:left="1440"/>
+      </w:pPr>
+    </w:p>
+    <w:p>
+      <w:pPr>
+        <w:ind w:left="1440"/>
+      </w:pPr>
+    </w:p>
+    <w:p>
+      <w:pPr>
+        <w:ind w:left="1440"/>
+      </w:pPr>
+    </w:p>
+    <w:p>
+      <w:pPr>
+        <w:ind w:left="1440"/>
+      </w:pPr>
+    </w:p>
+    <w:p>
+      <w:pPr>
+        <w:ind w:left="1440"/>
+      </w:pPr>
+    </w:p>
+    <w:p>
+      <w:pPr>
+        <w:pStyle w:val="Heading2"/>
+      </w:pPr>
+      <w:r>
+        <w:lastRenderedPageBreak/>
+        <w:t>The Vector Database Decision Matrix</w:t>
+      </w:r>
+    </w:p>
+    <w:p>
+      <w:pPr>
+        <w:ind w:left="1440"/>
+      </w:pPr>
+    </w:p>
+    <w:tbl>
+      <w:tblPr>
+        <w:tblW w:w="0" w:type="auto"/>
+        <w:tblCellSpacing w:w="15" w:type="dxa"/>
+        <w:tblCellMar>
+          <w:left w:w="0" w:type="dxa"/>
+          <w:right w:w="0" w:type="dxa"/>
+        </w:tblCellMar>
+        <w:tblLook w:val="04A0" w:firstRow="1" w:lastRow="0" w:firstColumn="1" w:lastColumn="0" w:noHBand="0" w:noVBand="1"/>
+      </w:tblPr>
+      <w:tblGrid>
+        <w:gridCol w:w="1516"/>
+        <w:gridCol w:w="1258"/>
+        <w:gridCol w:w="1494"/>
+        <w:gridCol w:w="1426"/>
+        <w:gridCol w:w="1669"/>
+        <w:gridCol w:w="1647"/>
+      </w:tblGrid>
+      <w:tr>
+        <w:trPr>
+          <w:tblHeader/>
+          <w:tblCellSpacing w:w="15" w:type="dxa"/>
+        </w:trPr>
+        <w:tc>
+          <w:tcPr>
+            <w:tcW w:w="0" w:type="auto"/>
+            <w:tcBorders>
+              <w:top w:val="single" w:sz="6" w:space="0" w:color="auto"/>
+              <w:left w:val="single" w:sz="6" w:space="0" w:color="auto"/>
+              <w:bottom w:val="single" w:sz="6" w:space="0" w:color="auto"/>
+              <w:right w:val="single" w:sz="6" w:space="0" w:color="auto"/>
+            </w:tcBorders>
+            <w:tcMar>
+              <w:top w:w="240" w:type="dxa"/>
+              <w:left w:w="0" w:type="dxa"/>
+              <w:bottom w:w="240" w:type="dxa"/>
+              <w:right w:w="180" w:type="dxa"/>
+            </w:tcMar>
+            <w:vAlign w:val="center"/>
+            <w:hideMark/>
+          </w:tcPr>
+          <w:p>
+            <w:pPr>
+              <w:spacing w:after="0" w:line="240" w:lineRule="auto"/>
+              <w:rPr>
+                <w:rFonts w:ascii="Arial" w:eastAsia="Times New Roman" w:hAnsi="Arial" w:cs="Arial"/>
+                <w:color w:val="1F1F1F"/>
+                <w:kern w:val="0"/>
+                <w:sz w:val="24"/>
+                <w:szCs w:val="24"/>
+                <w:lang w:eastAsia="en-IN"/>
+                <w14:ligatures w14:val="none"/>
+              </w:rPr>
+            </w:pPr>
+            <w:r>
+              <w:rPr>
+                <w:rFonts w:ascii="Arial" w:eastAsia="Times New Roman" w:hAnsi="Arial" w:cs="Arial"/>
+                <w:b/>
+                <w:bCs/>
+                <w:color w:val="1F1F1F"/>
+                <w:kern w:val="0"/>
+                <w:sz w:val="24"/>
+                <w:szCs w:val="24"/>
+                <w:bdr w:val="none" w:sz="0" w:space="0" w:color="auto" w:frame="1"/>
+                <w:lang w:eastAsia="en-IN"/>
+                <w14:ligatures w14:val="none"/>
+              </w:rPr>
+              <w:t>Feature</w:t>
+            </w:r>
+          </w:p>
+        </w:tc>
+        <w:tc>
+          <w:tcPr>
+            <w:tcW w:w="0" w:type="auto"/>
+            <w:tcBorders>
+              <w:top w:val="single" w:sz="6" w:space="0" w:color="auto"/>
+              <w:left w:val="single" w:sz="6" w:space="0" w:color="auto"/>
+              <w:bottom w:val="single" w:sz="6" w:space="0" w:color="auto"/>
+              <w:right w:val="single" w:sz="6" w:space="0" w:color="auto"/>
+            </w:tcBorders>
+            <w:tcMar>
+              <w:top w:w="240" w:type="dxa"/>
+              <w:left w:w="0" w:type="dxa"/>
+              <w:bottom w:w="240" w:type="dxa"/>
+              <w:right w:w="180" w:type="dxa"/>
+            </w:tcMar>
+            <w:vAlign w:val="center"/>
+            <w:hideMark/>
+          </w:tcPr>
+          <w:p>
+            <w:pPr>
+              <w:spacing w:after="0" w:line="240" w:lineRule="auto"/>
+              <w:rPr>
+                <w:rFonts w:ascii="Arial" w:eastAsia="Times New Roman" w:hAnsi="Arial" w:cs="Arial"/>
+                <w:color w:val="1F1F1F"/>
+                <w:kern w:val="0"/>
+                <w:sz w:val="24"/>
+                <w:szCs w:val="24"/>
+                <w:lang w:eastAsia="en-IN"/>
+                <w14:ligatures w14:val="none"/>
+              </w:rPr>
+            </w:pPr>
+            <w:r>
+              <w:rPr>
+                <w:rFonts w:ascii="Arial" w:eastAsia="Times New Roman" w:hAnsi="Arial" w:cs="Arial"/>
+                <w:b/>
+                <w:bCs/>
+                <w:color w:val="1F1F1F"/>
+                <w:kern w:val="0"/>
+                <w:sz w:val="24"/>
+                <w:szCs w:val="24"/>
+                <w:bdr w:val="none" w:sz="0" w:space="0" w:color="auto" w:frame="1"/>
+                <w:lang w:eastAsia="en-IN"/>
+                <w14:ligatures w14:val="none"/>
+              </w:rPr>
+              <w:t>FAISS (Library)</w:t>
+            </w:r>
+          </w:p>
+        </w:tc>
+        <w:tc>
+          <w:tcPr>
+            <w:tcW w:w="1464" w:type="dxa"/>
+            <w:tcBorders>
+              <w:top w:val="single" w:sz="6" w:space="0" w:color="auto"/>
+              <w:left w:val="single" w:sz="6" w:space="0" w:color="auto"/>
+              <w:bottom w:val="single" w:sz="6" w:space="0" w:color="auto"/>
+              <w:right w:val="single" w:sz="6" w:space="0" w:color="auto"/>
+            </w:tcBorders>
+            <w:tcMar>
+              <w:top w:w="240" w:type="dxa"/>
+              <w:left w:w="0" w:type="dxa"/>
+              <w:bottom w:w="240" w:type="dxa"/>
+              <w:right w:w="180" w:type="dxa"/>
+            </w:tcMar>
+            <w:vAlign w:val="center"/>
+            <w:hideMark/>
+          </w:tcPr>
+          <w:p>
+            <w:pPr>
+              <w:spacing w:after="0" w:line="240" w:lineRule="auto"/>
+              <w:rPr>
+                <w:rFonts w:ascii="Arial" w:eastAsia="Times New Roman" w:hAnsi="Arial" w:cs="Arial"/>
+                <w:color w:val="1F1F1F"/>
+                <w:kern w:val="0"/>
+                <w:sz w:val="24"/>
+                <w:szCs w:val="24"/>
+                <w:lang w:eastAsia="en-IN"/>
+                <w14:ligatures w14:val="none"/>
+              </w:rPr>
+            </w:pPr>
+            <w:proofErr w:type="spellStart"/>
+            <w:r>
+              <w:rPr>
+                <w:rFonts w:ascii="Arial" w:eastAsia="Times New Roman" w:hAnsi="Arial" w:cs="Arial"/>
+                <w:b/>
+                <w:bCs/>
+                <w:color w:val="1F1F1F"/>
+                <w:kern w:val="0"/>
+                <w:sz w:val="24"/>
+                <w:szCs w:val="24"/>
+                <w:bdr w:val="none" w:sz="0" w:space="0" w:color="auto" w:frame="1"/>
+                <w:lang w:eastAsia="en-IN"/>
+                <w14:ligatures w14:val="none"/>
+              </w:rPr>
+              <w:t>ChromaDB</w:t>
+            </w:r>
+            <w:proofErr w:type="spellEnd"/>
+            <w:r>
+              <w:rPr>
+                <w:rFonts w:ascii="Arial" w:eastAsia="Times New Roman" w:hAnsi="Arial" w:cs="Arial"/>
+                <w:b/>
+                <w:bCs/>
+                <w:color w:val="1F1F1F"/>
+                <w:kern w:val="0"/>
+                <w:sz w:val="24"/>
+                <w:szCs w:val="24"/>
+                <w:bdr w:val="none" w:sz="0" w:space="0" w:color="auto" w:frame="1"/>
+                <w:lang w:eastAsia="en-IN"/>
+                <w14:ligatures w14:val="none"/>
+              </w:rPr>
+              <w:t xml:space="preserve"> (Local DB)</w:t>
+            </w:r>
+          </w:p>
+        </w:tc>
+        <w:tc>
+          <w:tcPr>
+            <w:tcW w:w="1396" w:type="dxa"/>
+            <w:tcBorders>
+              <w:top w:val="single" w:sz="6" w:space="0" w:color="auto"/>
+              <w:left w:val="single" w:sz="6" w:space="0" w:color="auto"/>
+              <w:bottom w:val="single" w:sz="6" w:space="0" w:color="auto"/>
+              <w:right w:val="single" w:sz="6" w:space="0" w:color="auto"/>
+            </w:tcBorders>
+            <w:tcMar>
+              <w:top w:w="240" w:type="dxa"/>
+              <w:left w:w="0" w:type="dxa"/>
+              <w:bottom w:w="240" w:type="dxa"/>
+              <w:right w:w="180" w:type="dxa"/>
+            </w:tcMar>
+            <w:vAlign w:val="center"/>
+            <w:hideMark/>
+          </w:tcPr>
+          <w:p>
+            <w:pPr>
+              <w:spacing w:after="0" w:line="240" w:lineRule="auto"/>
+              <w:rPr>
+                <w:rFonts w:ascii="Arial" w:eastAsia="Times New Roman" w:hAnsi="Arial" w:cs="Arial"/>
+                <w:color w:val="1F1F1F"/>
+                <w:kern w:val="0"/>
+                <w:sz w:val="24"/>
+                <w:szCs w:val="24"/>
+                <w:lang w:eastAsia="en-IN"/>
+                <w14:ligatures w14:val="none"/>
+              </w:rPr>
+            </w:pPr>
+            <w:r>
+              <w:rPr>
+                <w:rFonts w:ascii="Arial" w:eastAsia="Times New Roman" w:hAnsi="Arial" w:cs="Arial"/>
+                <w:b/>
+                <w:bCs/>
+                <w:color w:val="1F1F1F"/>
+                <w:kern w:val="0"/>
+                <w:sz w:val="24"/>
+                <w:szCs w:val="24"/>
+                <w:bdr w:val="none" w:sz="0" w:space="0" w:color="auto" w:frame="1"/>
+                <w:lang w:eastAsia="en-IN"/>
+                <w14:ligatures w14:val="none"/>
+              </w:rPr>
+              <w:t>Pinecone (SaaS)</w:t>
+            </w:r>
+          </w:p>
+        </w:tc>
+        <w:tc>
+          <w:tcPr>
+            <w:tcW w:w="1639" w:type="dxa"/>
+            <w:tcBorders>
+              <w:top w:val="single" w:sz="6" w:space="0" w:color="auto"/>
+              <w:left w:val="single" w:sz="6" w:space="0" w:color="auto"/>
+              <w:bottom w:val="single" w:sz="6" w:space="0" w:color="auto"/>
+              <w:right w:val="single" w:sz="6" w:space="0" w:color="auto"/>
+            </w:tcBorders>
+            <w:tcMar>
+              <w:top w:w="240" w:type="dxa"/>
+              <w:left w:w="0" w:type="dxa"/>
+              <w:bottom w:w="240" w:type="dxa"/>
+              <w:right w:w="180" w:type="dxa"/>
+            </w:tcMar>
+            <w:vAlign w:val="center"/>
+            <w:hideMark/>
+          </w:tcPr>
+          <w:p>
+            <w:pPr>
+              <w:spacing w:after="0" w:line="240" w:lineRule="auto"/>
+              <w:rPr>
+                <w:rFonts w:ascii="Arial" w:eastAsia="Times New Roman" w:hAnsi="Arial" w:cs="Arial"/>
+                <w:color w:val="1F1F1F"/>
+                <w:kern w:val="0"/>
+                <w:sz w:val="24"/>
+                <w:szCs w:val="24"/>
+                <w:lang w:eastAsia="en-IN"/>
+                <w14:ligatures w14:val="none"/>
+              </w:rPr>
+            </w:pPr>
+            <w:proofErr w:type="spellStart"/>
+            <w:r>
+              <w:rPr>
+                <w:rFonts w:ascii="Arial" w:eastAsia="Times New Roman" w:hAnsi="Arial" w:cs="Arial"/>
+                <w:b/>
+                <w:bCs/>
+                <w:color w:val="1F1F1F"/>
+                <w:kern w:val="0"/>
+                <w:sz w:val="24"/>
+                <w:szCs w:val="24"/>
+                <w:bdr w:val="none" w:sz="0" w:space="0" w:color="auto" w:frame="1"/>
+                <w:lang w:eastAsia="en-IN"/>
+                <w14:ligatures w14:val="none"/>
+              </w:rPr>
+              <w:t>Qdrant</w:t>
+            </w:r>
+            <w:proofErr w:type="spellEnd"/>
+            <w:r>
+              <w:rPr>
+                <w:rFonts w:ascii="Arial" w:eastAsia="Times New Roman" w:hAnsi="Arial" w:cs="Arial"/>
+                <w:b/>
+                <w:bCs/>
+                <w:color w:val="1F1F1F"/>
+                <w:kern w:val="0"/>
+                <w:sz w:val="24"/>
+                <w:szCs w:val="24"/>
+                <w:bdr w:val="none" w:sz="0" w:space="0" w:color="auto" w:frame="1"/>
+                <w:lang w:eastAsia="en-IN"/>
+                <w14:ligatures w14:val="none"/>
+              </w:rPr>
+              <w:t xml:space="preserve"> (Production DB)</w:t>
+            </w:r>
+          </w:p>
+        </w:tc>
+        <w:tc>
+          <w:tcPr>
+            <w:tcW w:w="1602" w:type="dxa"/>
+            <w:tcBorders>
+              <w:top w:val="single" w:sz="6" w:space="0" w:color="auto"/>
+              <w:left w:val="single" w:sz="6" w:space="0" w:color="auto"/>
+              <w:bottom w:val="single" w:sz="6" w:space="0" w:color="auto"/>
+              <w:right w:val="single" w:sz="6" w:space="0" w:color="auto"/>
+            </w:tcBorders>
+            <w:tcMar>
+              <w:top w:w="240" w:type="dxa"/>
+              <w:left w:w="0" w:type="dxa"/>
+              <w:bottom w:w="240" w:type="dxa"/>
+              <w:right w:w="0" w:type="dxa"/>
+            </w:tcMar>
+            <w:vAlign w:val="center"/>
+            <w:hideMark/>
+          </w:tcPr>
+          <w:p>
+            <w:pPr>
+              <w:spacing w:after="0" w:line="240" w:lineRule="auto"/>
+              <w:rPr>
+                <w:rFonts w:ascii="Arial" w:eastAsia="Times New Roman" w:hAnsi="Arial" w:cs="Arial"/>
+                <w:color w:val="1F1F1F"/>
+                <w:kern w:val="0"/>
+                <w:sz w:val="24"/>
+                <w:szCs w:val="24"/>
+                <w:lang w:eastAsia="en-IN"/>
+                <w14:ligatures w14:val="none"/>
+              </w:rPr>
+            </w:pPr>
+            <w:r>
+              <w:rPr>
+                <w:rFonts w:ascii="Arial" w:eastAsia="Times New Roman" w:hAnsi="Arial" w:cs="Arial"/>
+                <w:b/>
+                <w:bCs/>
+                <w:color w:val="1F1F1F"/>
+                <w:kern w:val="0"/>
+                <w:sz w:val="24"/>
+                <w:szCs w:val="24"/>
+                <w:bdr w:val="none" w:sz="0" w:space="0" w:color="auto" w:frame="1"/>
+                <w:lang w:eastAsia="en-IN"/>
+                <w14:ligatures w14:val="none"/>
+              </w:rPr>
+              <w:t>Milvus (Enterprise)</w:t>
+            </w:r>
+          </w:p>
+        </w:tc>
+      </w:tr>
+      <w:tr>
+        <w:trPr>
+          <w:tblCellSpacing w:w="15" w:type="dxa"/>
+        </w:trPr>
+        <w:tc>
+          <w:tcPr>
+            <w:tcW w:w="0" w:type="auto"/>
+            <w:tcBorders>
+              <w:top w:val="single" w:sz="6" w:space="0" w:color="auto"/>
+              <w:left w:val="single" w:sz="6" w:space="0" w:color="auto"/>
+              <w:bottom w:val="single" w:sz="6" w:space="0" w:color="auto"/>
+              <w:right w:val="single" w:sz="6" w:space="0" w:color="auto"/>
+            </w:tcBorders>
+            <w:tcMar>
+              <w:top w:w="240" w:type="dxa"/>
+              <w:left w:w="0" w:type="dxa"/>
+              <w:bottom w:w="240" w:type="dxa"/>
+              <w:right w:w="180" w:type="dxa"/>
+            </w:tcMar>
+            <w:vAlign w:val="center"/>
+            <w:hideMark/>
+          </w:tcPr>
+          <w:p>
+            <w:pPr>
+              <w:spacing w:after="0" w:line="240" w:lineRule="auto"/>
+              <w:rPr>
+                <w:rFonts w:ascii="Arial" w:eastAsia="Times New Roman" w:hAnsi="Arial" w:cs="Arial"/>
+                <w:color w:val="1F1F1F"/>
+                <w:kern w:val="0"/>
+                <w:sz w:val="24"/>
+                <w:szCs w:val="24"/>
+                <w:lang w:eastAsia="en-IN"/>
+                <w14:ligatures w14:val="none"/>
+              </w:rPr>
+            </w:pPr>
+            <w:r>
+              <w:rPr>
+                <w:rFonts w:ascii="Arial" w:eastAsia="Times New Roman" w:hAnsi="Arial" w:cs="Arial"/>
+                <w:b/>
+                <w:bCs/>
+                <w:color w:val="1F1F1F"/>
+                <w:kern w:val="0"/>
+                <w:sz w:val="24"/>
+                <w:szCs w:val="24"/>
+                <w:bdr w:val="none" w:sz="0" w:space="0" w:color="auto" w:frame="1"/>
+                <w:lang w:eastAsia="en-IN"/>
+                <w14:ligatures w14:val="none"/>
+              </w:rPr>
+              <w:t>Primary Indexing</w:t>
+            </w:r>
+          </w:p>
+        </w:tc>
+        <w:tc>
+          <w:tcPr>
+            <w:tcW w:w="0" w:type="auto"/>
+            <w:tcBorders>
+              <w:top w:val="single" w:sz="6" w:space="0" w:color="auto"/>
+              <w:left w:val="single" w:sz="6" w:space="0" w:color="auto"/>
+              <w:bottom w:val="single" w:sz="6" w:space="0" w:color="auto"/>
+              <w:right w:val="single" w:sz="6" w:space="0" w:color="auto"/>
+            </w:tcBorders>
+            <w:tcMar>
+              <w:top w:w="240" w:type="dxa"/>
+              <w:left w:w="0" w:type="dxa"/>
+              <w:bottom w:w="240" w:type="dxa"/>
+              <w:right w:w="180" w:type="dxa"/>
+            </w:tcMar>
+            <w:vAlign w:val="center"/>
+            <w:hideMark/>
+          </w:tcPr>
+          <w:p>
+            <w:pPr>
+              <w:spacing w:after="0" w:line="240" w:lineRule="auto"/>
+              <w:rPr>
+                <w:rFonts w:ascii="Arial" w:eastAsia="Times New Roman" w:hAnsi="Arial" w:cs="Arial"/>
+                <w:color w:val="1F1F1F"/>
+                <w:kern w:val="0"/>
+                <w:lang w:eastAsia="en-IN"/>
+                <w14:ligatures w14:val="none"/>
+              </w:rPr>
+            </w:pPr>
+            <w:r>
+              <w:rPr>
+                <w:rFonts w:ascii="Arial" w:eastAsia="Times New Roman" w:hAnsi="Arial" w:cs="Arial"/>
+                <w:color w:val="1F1F1F"/>
+                <w:kern w:val="0"/>
+                <w:bdr w:val="none" w:sz="0" w:space="0" w:color="auto" w:frame="1"/>
+                <w:lang w:eastAsia="en-IN"/>
+                <w14:ligatures w14:val="none"/>
+              </w:rPr>
+              <w:t>IVF, HNSW, Flat, PQ</w:t>
+            </w:r>
+          </w:p>
+        </w:tc>
+        <w:tc>
+          <w:tcPr>
+            <w:tcW w:w="1464" w:type="dxa"/>
+            <w:tcBorders>
+              <w:top w:val="single" w:sz="6" w:space="0" w:color="auto"/>
+              <w:left w:val="single" w:sz="6" w:space="0" w:color="auto"/>
+              <w:bottom w:val="single" w:sz="6" w:space="0" w:color="auto"/>
+              <w:right w:val="single" w:sz="6" w:space="0" w:color="auto"/>
+            </w:tcBorders>
+            <w:tcMar>
+              <w:top w:w="240" w:type="dxa"/>
+              <w:left w:w="0" w:type="dxa"/>
+              <w:bottom w:w="240" w:type="dxa"/>
+              <w:right w:w="180" w:type="dxa"/>
+            </w:tcMar>
+            <w:vAlign w:val="center"/>
+            <w:hideMark/>
+          </w:tcPr>
+          <w:p>
+            <w:pPr>
+              <w:spacing w:after="0" w:line="240" w:lineRule="auto"/>
+              <w:rPr>
+                <w:rFonts w:ascii="Arial" w:eastAsia="Times New Roman" w:hAnsi="Arial" w:cs="Arial"/>
+                <w:color w:val="1F1F1F"/>
+                <w:kern w:val="0"/>
+                <w:lang w:eastAsia="en-IN"/>
+                <w14:ligatures w14:val="none"/>
+              </w:rPr>
+            </w:pPr>
+            <w:r>
+              <w:rPr>
+                <w:rFonts w:ascii="Arial" w:eastAsia="Times New Roman" w:hAnsi="Arial" w:cs="Arial"/>
+                <w:color w:val="1F1F1F"/>
+                <w:kern w:val="0"/>
+                <w:bdr w:val="none" w:sz="0" w:space="0" w:color="auto" w:frame="1"/>
+                <w:lang w:eastAsia="en-IN"/>
+                <w14:ligatures w14:val="none"/>
+              </w:rPr>
+              <w:t>HNSW</w:t>
+            </w:r>
+          </w:p>
+        </w:tc>
+        <w:tc>
+          <w:tcPr>
+            <w:tcW w:w="1396" w:type="dxa"/>
+            <w:tcBorders>
+              <w:top w:val="single" w:sz="6" w:space="0" w:color="auto"/>
+              <w:left w:val="single" w:sz="6" w:space="0" w:color="auto"/>
+              <w:bottom w:val="single" w:sz="6" w:space="0" w:color="auto"/>
+              <w:right w:val="single" w:sz="6" w:space="0" w:color="auto"/>
+            </w:tcBorders>
+            <w:tcMar>
+              <w:top w:w="240" w:type="dxa"/>
+              <w:left w:w="0" w:type="dxa"/>
+              <w:bottom w:w="240" w:type="dxa"/>
+              <w:right w:w="180" w:type="dxa"/>
+            </w:tcMar>
+            <w:vAlign w:val="center"/>
+            <w:hideMark/>
+          </w:tcPr>
+          <w:p>
+            <w:pPr>
+              <w:spacing w:after="0" w:line="240" w:lineRule="auto"/>
+              <w:rPr>
+                <w:rFonts w:ascii="Arial" w:eastAsia="Times New Roman" w:hAnsi="Arial" w:cs="Arial"/>
+                <w:color w:val="1F1F1F"/>
+                <w:kern w:val="0"/>
+                <w:lang w:eastAsia="en-IN"/>
+                <w14:ligatures w14:val="none"/>
+              </w:rPr>
+            </w:pPr>
+            <w:r>
+              <w:rPr>
+                <w:rFonts w:ascii="Arial" w:eastAsia="Times New Roman" w:hAnsi="Arial" w:cs="Arial"/>
+                <w:color w:val="1F1F1F"/>
+                <w:kern w:val="0"/>
+                <w:bdr w:val="none" w:sz="0" w:space="0" w:color="auto" w:frame="1"/>
+                <w:lang w:eastAsia="en-IN"/>
+                <w14:ligatures w14:val="none"/>
+              </w:rPr>
+              <w:t>Proprietary Graph</w:t>
+            </w:r>
+          </w:p>
+        </w:tc>
+        <w:tc>
+          <w:tcPr>
+            <w:tcW w:w="1639" w:type="dxa"/>
+            <w:tcBorders>
+              <w:top w:val="single" w:sz="6" w:space="0" w:color="auto"/>
+              <w:left w:val="single" w:sz="6" w:space="0" w:color="auto"/>
+              <w:bottom w:val="single" w:sz="6" w:space="0" w:color="auto"/>
+              <w:right w:val="single" w:sz="6" w:space="0" w:color="auto"/>
+            </w:tcBorders>
+            <w:tcMar>
+              <w:top w:w="240" w:type="dxa"/>
+              <w:left w:w="0" w:type="dxa"/>
+              <w:bottom w:w="240" w:type="dxa"/>
+              <w:right w:w="180" w:type="dxa"/>
+            </w:tcMar>
+            <w:vAlign w:val="center"/>
+            <w:hideMark/>
+          </w:tcPr>
+          <w:p>
+            <w:pPr>
+              <w:spacing w:after="0" w:line="240" w:lineRule="auto"/>
+              <w:rPr>
+                <w:rFonts w:ascii="Arial" w:eastAsia="Times New Roman" w:hAnsi="Arial" w:cs="Arial"/>
+                <w:color w:val="1F1F1F"/>
+                <w:kern w:val="0"/>
+                <w:lang w:eastAsia="en-IN"/>
+                <w14:ligatures w14:val="none"/>
+              </w:rPr>
+            </w:pPr>
+            <w:r>
+              <w:rPr>
+                <w:rFonts w:ascii="Arial" w:eastAsia="Times New Roman" w:hAnsi="Arial" w:cs="Arial"/>
+                <w:b/>
+                <w:bCs/>
+                <w:color w:val="1F1F1F"/>
+                <w:kern w:val="0"/>
+                <w:bdr w:val="none" w:sz="0" w:space="0" w:color="auto" w:frame="1"/>
+                <w:lang w:eastAsia="en-IN"/>
+                <w14:ligatures w14:val="none"/>
+              </w:rPr>
+              <w:t>Filtered HNSW</w:t>
+            </w:r>
+          </w:p>
+        </w:tc>
+        <w:tc>
+          <w:tcPr>
+            <w:tcW w:w="1602" w:type="dxa"/>
+            <w:tcBorders>
+              <w:top w:val="single" w:sz="6" w:space="0" w:color="auto"/>
+              <w:left w:val="single" w:sz="6" w:space="0" w:color="auto"/>
+              <w:bottom w:val="single" w:sz="6" w:space="0" w:color="auto"/>
+              <w:right w:val="single" w:sz="6" w:space="0" w:color="auto"/>
+            </w:tcBorders>
+            <w:tcMar>
+              <w:top w:w="240" w:type="dxa"/>
+              <w:left w:w="0" w:type="dxa"/>
+              <w:bottom w:w="240" w:type="dxa"/>
+              <w:right w:w="0" w:type="dxa"/>
+            </w:tcMar>
+            <w:vAlign w:val="center"/>
+            <w:hideMark/>
+          </w:tcPr>
+          <w:p>
+            <w:pPr>
+              <w:spacing w:after="0" w:line="240" w:lineRule="auto"/>
+              <w:rPr>
+                <w:rFonts w:ascii="Arial" w:eastAsia="Times New Roman" w:hAnsi="Arial" w:cs="Arial"/>
+                <w:color w:val="1F1F1F"/>
+                <w:kern w:val="0"/>
+                <w:lang w:eastAsia="en-IN"/>
+                <w14:ligatures w14:val="none"/>
+              </w:rPr>
+            </w:pPr>
+            <w:proofErr w:type="spellStart"/>
+            <w:r>
+              <w:rPr>
+                <w:rFonts w:ascii="Arial" w:eastAsia="Times New Roman" w:hAnsi="Arial" w:cs="Arial"/>
+                <w:color w:val="1F1F1F"/>
+                <w:kern w:val="0"/>
+                <w:bdr w:val="none" w:sz="0" w:space="0" w:color="auto" w:frame="1"/>
+                <w:lang w:eastAsia="en-IN"/>
+                <w14:ligatures w14:val="none"/>
+              </w:rPr>
+              <w:t>DiskANN</w:t>
+            </w:r>
+            <w:proofErr w:type="spellEnd"/>
+            <w:r>
+              <w:rPr>
+                <w:rFonts w:ascii="Arial" w:eastAsia="Times New Roman" w:hAnsi="Arial" w:cs="Arial"/>
+                <w:color w:val="1F1F1F"/>
+                <w:kern w:val="0"/>
+                <w:bdr w:val="none" w:sz="0" w:space="0" w:color="auto" w:frame="1"/>
+                <w:lang w:eastAsia="en-IN"/>
+                <w14:ligatures w14:val="none"/>
+              </w:rPr>
+              <w:t>, HNSW, IVF</w:t>
+            </w:r>
+          </w:p>
+        </w:tc>
+      </w:tr>
+      <w:tr>
+        <w:trPr>
+          <w:tblCellSpacing w:w="15" w:type="dxa"/>
+        </w:trPr>
+        <w:tc>
+          <w:tcPr>
+            <w:tcW w:w="0" w:type="auto"/>
+            <w:tcBorders>
+              <w:top w:val="single" w:sz="6" w:space="0" w:color="auto"/>
+              <w:left w:val="single" w:sz="6" w:space="0" w:color="auto"/>
+              <w:bottom w:val="single" w:sz="6" w:space="0" w:color="auto"/>
+              <w:right w:val="single" w:sz="6" w:space="0" w:color="auto"/>
+            </w:tcBorders>
+            <w:tcMar>
+              <w:top w:w="240" w:type="dxa"/>
+              <w:left w:w="0" w:type="dxa"/>
+              <w:bottom w:w="240" w:type="dxa"/>
+              <w:right w:w="180" w:type="dxa"/>
+            </w:tcMar>
+            <w:vAlign w:val="center"/>
+            <w:hideMark/>
+          </w:tcPr>
+          <w:p>
+            <w:pPr>
+              <w:spacing w:after="0" w:line="240" w:lineRule="auto"/>
+              <w:rPr>
+                <w:rFonts w:ascii="Arial" w:eastAsia="Times New Roman" w:hAnsi="Arial" w:cs="Arial"/>
+                <w:color w:val="1F1F1F"/>
+                <w:kern w:val="0"/>
+                <w:sz w:val="24"/>
+                <w:szCs w:val="24"/>
+                <w:lang w:eastAsia="en-IN"/>
+                <w14:ligatures w14:val="none"/>
+              </w:rPr>
+            </w:pPr>
+            <w:r>
+              <w:rPr>
+                <w:rFonts w:ascii="Arial" w:eastAsia="Times New Roman" w:hAnsi="Arial" w:cs="Arial"/>
+                <w:b/>
+                <w:bCs/>
+                <w:color w:val="1F1F1F"/>
+                <w:kern w:val="0"/>
+                <w:sz w:val="24"/>
+                <w:szCs w:val="24"/>
+                <w:bdr w:val="none" w:sz="0" w:space="0" w:color="auto" w:frame="1"/>
+                <w:lang w:eastAsia="en-IN"/>
+                <w14:ligatures w14:val="none"/>
+              </w:rPr>
+              <w:t>Data Storage</w:t>
+            </w:r>
+          </w:p>
+        </w:tc>
+        <w:tc>
+          <w:tcPr>
+            <w:tcW w:w="0" w:type="auto"/>
+            <w:tcBorders>
+              <w:top w:val="single" w:sz="6" w:space="0" w:color="auto"/>
+              <w:left w:val="single" w:sz="6" w:space="0" w:color="auto"/>
+              <w:bottom w:val="single" w:sz="6" w:space="0" w:color="auto"/>
+              <w:right w:val="single" w:sz="6" w:space="0" w:color="auto"/>
+            </w:tcBorders>
+            <w:tcMar>
+              <w:top w:w="240" w:type="dxa"/>
+              <w:left w:w="0" w:type="dxa"/>
+              <w:bottom w:w="240" w:type="dxa"/>
+              <w:right w:w="180" w:type="dxa"/>
+            </w:tcMar>
+            <w:vAlign w:val="center"/>
+            <w:hideMark/>
+          </w:tcPr>
+          <w:p>
+            <w:pPr>
+              <w:spacing w:after="0" w:line="240" w:lineRule="auto"/>
+              <w:rPr>
+                <w:rFonts w:ascii="Arial" w:eastAsia="Times New Roman" w:hAnsi="Arial" w:cs="Arial"/>
+                <w:color w:val="1F1F1F"/>
+                <w:kern w:val="0"/>
+                <w:lang w:eastAsia="en-IN"/>
+                <w14:ligatures w14:val="none"/>
+              </w:rPr>
+            </w:pPr>
+            <w:r>
+              <w:rPr>
+                <w:rFonts w:ascii="Arial" w:eastAsia="Times New Roman" w:hAnsi="Arial" w:cs="Arial"/>
+                <w:color w:val="1F1F1F"/>
+                <w:kern w:val="0"/>
+                <w:bdr w:val="none" w:sz="0" w:space="0" w:color="auto" w:frame="1"/>
+                <w:lang w:eastAsia="en-IN"/>
+                <w14:ligatures w14:val="none"/>
+              </w:rPr>
+              <w:t>RAM / Local File</w:t>
+            </w:r>
+          </w:p>
+        </w:tc>
+        <w:tc>
+          <w:tcPr>
+            <w:tcW w:w="1464" w:type="dxa"/>
+            <w:tcBorders>
+              <w:top w:val="single" w:sz="6" w:space="0" w:color="auto"/>
+              <w:left w:val="single" w:sz="6" w:space="0" w:color="auto"/>
+              <w:bottom w:val="single" w:sz="6" w:space="0" w:color="auto"/>
+              <w:right w:val="single" w:sz="6" w:space="0" w:color="auto"/>
+            </w:tcBorders>
+            <w:tcMar>
+              <w:top w:w="240" w:type="dxa"/>
+              <w:left w:w="0" w:type="dxa"/>
+              <w:bottom w:w="240" w:type="dxa"/>
+              <w:right w:w="180" w:type="dxa"/>
+            </w:tcMar>
+            <w:vAlign w:val="center"/>
+            <w:hideMark/>
+          </w:tcPr>
+          <w:p>
+            <w:pPr>
+              <w:spacing w:after="0" w:line="240" w:lineRule="auto"/>
+              <w:rPr>
+                <w:rFonts w:ascii="Arial" w:eastAsia="Times New Roman" w:hAnsi="Arial" w:cs="Arial"/>
+                <w:color w:val="1F1F1F"/>
+                <w:kern w:val="0"/>
+                <w:lang w:eastAsia="en-IN"/>
+                <w14:ligatures w14:val="none"/>
+              </w:rPr>
+            </w:pPr>
+            <w:r>
+              <w:rPr>
+                <w:rFonts w:ascii="Arial" w:eastAsia="Times New Roman" w:hAnsi="Arial" w:cs="Arial"/>
+                <w:color w:val="1F1F1F"/>
+                <w:kern w:val="0"/>
+                <w:bdr w:val="none" w:sz="0" w:space="0" w:color="auto" w:frame="1"/>
+                <w:lang w:eastAsia="en-IN"/>
+                <w14:ligatures w14:val="none"/>
+              </w:rPr>
+              <w:t>SQLite / Parquet</w:t>
+            </w:r>
+          </w:p>
+        </w:tc>
+        <w:tc>
+          <w:tcPr>
+            <w:tcW w:w="1396" w:type="dxa"/>
+            <w:tcBorders>
+              <w:top w:val="single" w:sz="6" w:space="0" w:color="auto"/>
+              <w:left w:val="single" w:sz="6" w:space="0" w:color="auto"/>
+              <w:bottom w:val="single" w:sz="6" w:space="0" w:color="auto"/>
+              <w:right w:val="single" w:sz="6" w:space="0" w:color="auto"/>
+            </w:tcBorders>
+            <w:tcMar>
+              <w:top w:w="240" w:type="dxa"/>
+              <w:left w:w="0" w:type="dxa"/>
+              <w:bottom w:w="240" w:type="dxa"/>
+              <w:right w:w="180" w:type="dxa"/>
+            </w:tcMar>
+            <w:vAlign w:val="center"/>
+            <w:hideMark/>
+          </w:tcPr>
+          <w:p>
+            <w:pPr>
+              <w:spacing w:after="0" w:line="240" w:lineRule="auto"/>
+              <w:rPr>
+                <w:rFonts w:ascii="Arial" w:eastAsia="Times New Roman" w:hAnsi="Arial" w:cs="Arial"/>
+                <w:color w:val="1F1F1F"/>
+                <w:kern w:val="0"/>
+                <w:lang w:eastAsia="en-IN"/>
+                <w14:ligatures w14:val="none"/>
+              </w:rPr>
+            </w:pPr>
+            <w:r>
+              <w:rPr>
+                <w:rFonts w:ascii="Arial" w:eastAsia="Times New Roman" w:hAnsi="Arial" w:cs="Arial"/>
+                <w:color w:val="1F1F1F"/>
+                <w:kern w:val="0"/>
+                <w:bdr w:val="none" w:sz="0" w:space="0" w:color="auto" w:frame="1"/>
+                <w:lang w:eastAsia="en-IN"/>
+                <w14:ligatures w14:val="none"/>
+              </w:rPr>
+              <w:t>Cloud Managed</w:t>
+            </w:r>
+          </w:p>
+        </w:tc>
+        <w:tc>
+          <w:tcPr>
+            <w:tcW w:w="1639" w:type="dxa"/>
+            <w:tcBorders>
+              <w:top w:val="single" w:sz="6" w:space="0" w:color="auto"/>
+              <w:left w:val="single" w:sz="6" w:space="0" w:color="auto"/>
+              <w:bottom w:val="single" w:sz="6" w:space="0" w:color="auto"/>
+              <w:right w:val="single" w:sz="6" w:space="0" w:color="auto"/>
+            </w:tcBorders>
+            <w:tcMar>
+              <w:top w:w="240" w:type="dxa"/>
+              <w:left w:w="0" w:type="dxa"/>
+              <w:bottom w:w="240" w:type="dxa"/>
+              <w:right w:w="180" w:type="dxa"/>
+            </w:tcMar>
+            <w:vAlign w:val="center"/>
+            <w:hideMark/>
+          </w:tcPr>
+          <w:p>
+            <w:pPr>
+              <w:spacing w:after="0" w:line="240" w:lineRule="auto"/>
+              <w:rPr>
+                <w:rFonts w:ascii="Arial" w:eastAsia="Times New Roman" w:hAnsi="Arial" w:cs="Arial"/>
+                <w:color w:val="1F1F1F"/>
+                <w:kern w:val="0"/>
+                <w:lang w:eastAsia="en-IN"/>
+                <w14:ligatures w14:val="none"/>
+              </w:rPr>
+            </w:pPr>
+            <w:r>
+              <w:rPr>
+                <w:rFonts w:ascii="Arial" w:eastAsia="Times New Roman" w:hAnsi="Arial" w:cs="Arial"/>
+                <w:b/>
+                <w:bCs/>
+                <w:color w:val="1F1F1F"/>
+                <w:kern w:val="0"/>
+                <w:bdr w:val="none" w:sz="0" w:space="0" w:color="auto" w:frame="1"/>
+                <w:lang w:eastAsia="en-IN"/>
+                <w14:ligatures w14:val="none"/>
+              </w:rPr>
+              <w:t>Local or Cloud (SaaS)</w:t>
+            </w:r>
+          </w:p>
+        </w:tc>
+        <w:tc>
+          <w:tcPr>
+            <w:tcW w:w="1602" w:type="dxa"/>
+            <w:tcBorders>
+              <w:top w:val="single" w:sz="6" w:space="0" w:color="auto"/>
+              <w:left w:val="single" w:sz="6" w:space="0" w:color="auto"/>
+              <w:bottom w:val="single" w:sz="6" w:space="0" w:color="auto"/>
+              <w:right w:val="single" w:sz="6" w:space="0" w:color="auto"/>
+            </w:tcBorders>
+            <w:tcMar>
+              <w:top w:w="240" w:type="dxa"/>
+              <w:left w:w="0" w:type="dxa"/>
+              <w:bottom w:w="240" w:type="dxa"/>
+              <w:right w:w="0" w:type="dxa"/>
+            </w:tcMar>
+            <w:vAlign w:val="center"/>
+            <w:hideMark/>
+          </w:tcPr>
+          <w:p>
+            <w:pPr>
+              <w:spacing w:after="0" w:line="240" w:lineRule="auto"/>
+              <w:rPr>
+                <w:rFonts w:ascii="Arial" w:eastAsia="Times New Roman" w:hAnsi="Arial" w:cs="Arial"/>
+                <w:color w:val="1F1F1F"/>
+                <w:kern w:val="0"/>
+                <w:lang w:eastAsia="en-IN"/>
+                <w14:ligatures w14:val="none"/>
+              </w:rPr>
+            </w:pPr>
+            <w:r>
+              <w:rPr>
+                <w:rFonts w:ascii="Arial" w:eastAsia="Times New Roman" w:hAnsi="Arial" w:cs="Arial"/>
+                <w:color w:val="1F1F1F"/>
+                <w:kern w:val="0"/>
+                <w:bdr w:val="none" w:sz="0" w:space="0" w:color="auto" w:frame="1"/>
+                <w:lang w:eastAsia="en-IN"/>
+                <w14:ligatures w14:val="none"/>
+              </w:rPr>
+              <w:t xml:space="preserve">S3 / </w:t>
+            </w:r>
+            <w:proofErr w:type="spellStart"/>
+            <w:r>
+              <w:rPr>
+                <w:rFonts w:ascii="Arial" w:eastAsia="Times New Roman" w:hAnsi="Arial" w:cs="Arial"/>
+                <w:color w:val="1F1F1F"/>
+                <w:kern w:val="0"/>
+                <w:bdr w:val="none" w:sz="0" w:space="0" w:color="auto" w:frame="1"/>
+                <w:lang w:eastAsia="en-IN"/>
+                <w14:ligatures w14:val="none"/>
+              </w:rPr>
+              <w:t>MinIO</w:t>
+            </w:r>
+            <w:proofErr w:type="spellEnd"/>
+            <w:r>
+              <w:rPr>
+                <w:rFonts w:ascii="Arial" w:eastAsia="Times New Roman" w:hAnsi="Arial" w:cs="Arial"/>
+                <w:color w:val="1F1F1F"/>
+                <w:kern w:val="0"/>
+                <w:bdr w:val="none" w:sz="0" w:space="0" w:color="auto" w:frame="1"/>
+                <w:lang w:eastAsia="en-IN"/>
+                <w14:ligatures w14:val="none"/>
+              </w:rPr>
+              <w:t xml:space="preserve"> / Distributed</w:t>
+            </w:r>
+          </w:p>
+        </w:tc>
+      </w:tr>
+      <w:tr>
+        <w:trPr>
+          <w:tblCellSpacing w:w="15" w:type="dxa"/>
+        </w:trPr>
+        <w:tc>
+          <w:tcPr>
+            <w:tcW w:w="0" w:type="auto"/>
+            <w:tcBorders>
+              <w:top w:val="single" w:sz="6" w:space="0" w:color="auto"/>
+              <w:left w:val="single" w:sz="6" w:space="0" w:color="auto"/>
+              <w:bottom w:val="single" w:sz="6" w:space="0" w:color="auto"/>
+              <w:right w:val="single" w:sz="6" w:space="0" w:color="auto"/>
+            </w:tcBorders>
+            <w:tcMar>
+              <w:top w:w="240" w:type="dxa"/>
+              <w:left w:w="0" w:type="dxa"/>
+              <w:bottom w:w="240" w:type="dxa"/>
+              <w:right w:w="180" w:type="dxa"/>
+            </w:tcMar>
+            <w:vAlign w:val="center"/>
+            <w:hideMark/>
+          </w:tcPr>
+          <w:p>
+            <w:pPr>
+              <w:spacing w:after="0" w:line="240" w:lineRule="auto"/>
+              <w:rPr>
+                <w:rFonts w:ascii="Arial" w:eastAsia="Times New Roman" w:hAnsi="Arial" w:cs="Arial"/>
+                <w:color w:val="1F1F1F"/>
+                <w:kern w:val="0"/>
+                <w:sz w:val="24"/>
+                <w:szCs w:val="24"/>
+                <w:lang w:eastAsia="en-IN"/>
+                <w14:ligatures w14:val="none"/>
+              </w:rPr>
+            </w:pPr>
+            <w:r>
+              <w:rPr>
+                <w:rFonts w:ascii="Arial" w:eastAsia="Times New Roman" w:hAnsi="Arial" w:cs="Arial"/>
+                <w:b/>
+                <w:bCs/>
+                <w:color w:val="1F1F1F"/>
+                <w:kern w:val="0"/>
+                <w:sz w:val="24"/>
+                <w:szCs w:val="24"/>
+                <w:bdr w:val="none" w:sz="0" w:space="0" w:color="auto" w:frame="1"/>
+                <w:lang w:eastAsia="en-IN"/>
+                <w14:ligatures w14:val="none"/>
+              </w:rPr>
+              <w:t>Metadata Filtering</w:t>
+            </w:r>
+          </w:p>
+        </w:tc>
+        <w:tc>
+          <w:tcPr>
+            <w:tcW w:w="0" w:type="auto"/>
+            <w:tcBorders>
+              <w:top w:val="single" w:sz="6" w:space="0" w:color="auto"/>
+              <w:left w:val="single" w:sz="6" w:space="0" w:color="auto"/>
+              <w:bottom w:val="single" w:sz="6" w:space="0" w:color="auto"/>
+              <w:right w:val="single" w:sz="6" w:space="0" w:color="auto"/>
+            </w:tcBorders>
+            <w:tcMar>
+              <w:top w:w="240" w:type="dxa"/>
+              <w:left w:w="0" w:type="dxa"/>
+              <w:bottom w:w="240" w:type="dxa"/>
+              <w:right w:w="180" w:type="dxa"/>
+            </w:tcMar>
+            <w:vAlign w:val="center"/>
+            <w:hideMark/>
+          </w:tcPr>
+          <w:p>
+            <w:pPr>
+              <w:spacing w:after="0" w:line="240" w:lineRule="auto"/>
+              <w:rPr>
+                <w:rFonts w:ascii="Arial" w:eastAsia="Times New Roman" w:hAnsi="Arial" w:cs="Arial"/>
+                <w:color w:val="1F1F1F"/>
+                <w:kern w:val="0"/>
+                <w:lang w:eastAsia="en-IN"/>
+                <w14:ligatures w14:val="none"/>
+              </w:rPr>
+            </w:pPr>
+            <w:r>
+              <w:rPr>
+                <w:rFonts w:ascii="Arial" w:eastAsia="Times New Roman" w:hAnsi="Arial" w:cs="Arial"/>
+                <w:color w:val="1F1F1F"/>
+                <w:kern w:val="0"/>
+                <w:bdr w:val="none" w:sz="0" w:space="0" w:color="auto" w:frame="1"/>
+                <w:lang w:eastAsia="en-IN"/>
+                <w14:ligatures w14:val="none"/>
+              </w:rPr>
+              <w:t>Post-filtering (Manual)</w:t>
+            </w:r>
+          </w:p>
+        </w:tc>
+        <w:tc>
+          <w:tcPr>
+            <w:tcW w:w="1464" w:type="dxa"/>
+            <w:tcBorders>
+              <w:top w:val="single" w:sz="6" w:space="0" w:color="auto"/>
+              <w:left w:val="single" w:sz="6" w:space="0" w:color="auto"/>
+              <w:bottom w:val="single" w:sz="6" w:space="0" w:color="auto"/>
+              <w:right w:val="single" w:sz="6" w:space="0" w:color="auto"/>
+            </w:tcBorders>
+            <w:tcMar>
+              <w:top w:w="240" w:type="dxa"/>
+              <w:left w:w="0" w:type="dxa"/>
+              <w:bottom w:w="240" w:type="dxa"/>
+              <w:right w:w="180" w:type="dxa"/>
+            </w:tcMar>
+            <w:vAlign w:val="center"/>
+            <w:hideMark/>
+          </w:tcPr>
+          <w:p>
+            <w:pPr>
+              <w:spacing w:after="0" w:line="240" w:lineRule="auto"/>
+              <w:rPr>
+                <w:rFonts w:ascii="Arial" w:eastAsia="Times New Roman" w:hAnsi="Arial" w:cs="Arial"/>
+                <w:color w:val="1F1F1F"/>
+                <w:kern w:val="0"/>
+                <w:lang w:eastAsia="en-IN"/>
+                <w14:ligatures w14:val="none"/>
+              </w:rPr>
+            </w:pPr>
+            <w:r>
+              <w:rPr>
+                <w:rFonts w:ascii="Arial" w:eastAsia="Times New Roman" w:hAnsi="Arial" w:cs="Arial"/>
+                <w:color w:val="1F1F1F"/>
+                <w:kern w:val="0"/>
+                <w:bdr w:val="none" w:sz="0" w:space="0" w:color="auto" w:frame="1"/>
+                <w:lang w:eastAsia="en-IN"/>
+                <w14:ligatures w14:val="none"/>
+              </w:rPr>
+              <w:t>Pre-filtering (Native)</w:t>
+            </w:r>
+          </w:p>
+        </w:tc>
+        <w:tc>
+          <w:tcPr>
+            <w:tcW w:w="1396" w:type="dxa"/>
+            <w:tcBorders>
+              <w:top w:val="single" w:sz="6" w:space="0" w:color="auto"/>
+              <w:left w:val="single" w:sz="6" w:space="0" w:color="auto"/>
+              <w:bottom w:val="single" w:sz="6" w:space="0" w:color="auto"/>
+              <w:right w:val="single" w:sz="6" w:space="0" w:color="auto"/>
+            </w:tcBorders>
+            <w:tcMar>
+              <w:top w:w="240" w:type="dxa"/>
+              <w:left w:w="0" w:type="dxa"/>
+              <w:bottom w:w="240" w:type="dxa"/>
+              <w:right w:w="180" w:type="dxa"/>
+            </w:tcMar>
+            <w:vAlign w:val="center"/>
+            <w:hideMark/>
+          </w:tcPr>
+          <w:p>
+            <w:pPr>
+              <w:spacing w:after="0" w:line="240" w:lineRule="auto"/>
+              <w:rPr>
+                <w:rFonts w:ascii="Arial" w:eastAsia="Times New Roman" w:hAnsi="Arial" w:cs="Arial"/>
+                <w:color w:val="1F1F1F"/>
+                <w:kern w:val="0"/>
+                <w:lang w:eastAsia="en-IN"/>
+                <w14:ligatures w14:val="none"/>
+              </w:rPr>
+            </w:pPr>
+            <w:r>
+              <w:rPr>
+                <w:rFonts w:ascii="Arial" w:eastAsia="Times New Roman" w:hAnsi="Arial" w:cs="Arial"/>
+                <w:color w:val="1F1F1F"/>
+                <w:kern w:val="0"/>
+                <w:bdr w:val="none" w:sz="0" w:space="0" w:color="auto" w:frame="1"/>
+                <w:lang w:eastAsia="en-IN"/>
+                <w14:ligatures w14:val="none"/>
+              </w:rPr>
+              <w:t>Pre-filtering (Native)</w:t>
+            </w:r>
+          </w:p>
+        </w:tc>
+        <w:tc>
+          <w:tcPr>
+            <w:tcW w:w="1639" w:type="dxa"/>
+            <w:tcBorders>
+              <w:top w:val="single" w:sz="6" w:space="0" w:color="auto"/>
+              <w:left w:val="single" w:sz="6" w:space="0" w:color="auto"/>
+              <w:bottom w:val="single" w:sz="6" w:space="0" w:color="auto"/>
+              <w:right w:val="single" w:sz="6" w:space="0" w:color="auto"/>
+            </w:tcBorders>
+            <w:tcMar>
+              <w:top w:w="240" w:type="dxa"/>
+              <w:left w:w="0" w:type="dxa"/>
+              <w:bottom w:w="240" w:type="dxa"/>
+              <w:right w:w="180" w:type="dxa"/>
+            </w:tcMar>
+            <w:vAlign w:val="center"/>
+            <w:hideMark/>
+          </w:tcPr>
+          <w:p>
+            <w:pPr>
+              <w:spacing w:after="0" w:line="240" w:lineRule="auto"/>
+              <w:rPr>
+                <w:rFonts w:ascii="Arial" w:eastAsia="Times New Roman" w:hAnsi="Arial" w:cs="Arial"/>
+                <w:color w:val="1F1F1F"/>
+                <w:kern w:val="0"/>
+                <w:lang w:eastAsia="en-IN"/>
+                <w14:ligatures w14:val="none"/>
+              </w:rPr>
+            </w:pPr>
+            <w:r>
+              <w:rPr>
+                <w:rFonts w:ascii="Arial" w:eastAsia="Times New Roman" w:hAnsi="Arial" w:cs="Arial"/>
+                <w:b/>
+                <w:bCs/>
+                <w:color w:val="1F1F1F"/>
+                <w:kern w:val="0"/>
+                <w:bdr w:val="none" w:sz="0" w:space="0" w:color="auto" w:frame="1"/>
+                <w:lang w:eastAsia="en-IN"/>
+                <w14:ligatures w14:val="none"/>
+              </w:rPr>
+              <w:t>Advanced Boolean</w:t>
+            </w:r>
+          </w:p>
+        </w:tc>
+        <w:tc>
+          <w:tcPr>
+            <w:tcW w:w="1602" w:type="dxa"/>
+            <w:tcBorders>
+              <w:top w:val="single" w:sz="6" w:space="0" w:color="auto"/>
+              <w:left w:val="single" w:sz="6" w:space="0" w:color="auto"/>
+              <w:bottom w:val="single" w:sz="6" w:space="0" w:color="auto"/>
+              <w:right w:val="single" w:sz="6" w:space="0" w:color="auto"/>
+            </w:tcBorders>
+            <w:tcMar>
+              <w:top w:w="240" w:type="dxa"/>
+              <w:left w:w="0" w:type="dxa"/>
+              <w:bottom w:w="240" w:type="dxa"/>
+              <w:right w:w="0" w:type="dxa"/>
+            </w:tcMar>
+            <w:vAlign w:val="center"/>
+            <w:hideMark/>
+          </w:tcPr>
+          <w:p>
+            <w:pPr>
+              <w:spacing w:after="0" w:line="240" w:lineRule="auto"/>
+              <w:rPr>
+                <w:rFonts w:ascii="Arial" w:eastAsia="Times New Roman" w:hAnsi="Arial" w:cs="Arial"/>
+                <w:color w:val="1F1F1F"/>
+                <w:kern w:val="0"/>
+                <w:lang w:eastAsia="en-IN"/>
+                <w14:ligatures w14:val="none"/>
+              </w:rPr>
+            </w:pPr>
+            <w:r>
+              <w:rPr>
+                <w:rFonts w:ascii="Arial" w:eastAsia="Times New Roman" w:hAnsi="Arial" w:cs="Arial"/>
+                <w:color w:val="1F1F1F"/>
+                <w:kern w:val="0"/>
+                <w:bdr w:val="none" w:sz="0" w:space="0" w:color="auto" w:frame="1"/>
+                <w:lang w:eastAsia="en-IN"/>
+                <w14:ligatures w14:val="none"/>
+              </w:rPr>
+              <w:t>Expression-based</w:t>
+            </w:r>
+          </w:p>
+        </w:tc>
+      </w:tr>
+      <w:tr>
+        <w:trPr>
+          <w:tblCellSpacing w:w="15" w:type="dxa"/>
+        </w:trPr>
+        <w:tc>
+          <w:tcPr>
+            <w:tcW w:w="0" w:type="auto"/>
+            <w:tcBorders>
+              <w:top w:val="single" w:sz="6" w:space="0" w:color="auto"/>
+              <w:left w:val="single" w:sz="6" w:space="0" w:color="auto"/>
+              <w:bottom w:val="single" w:sz="6" w:space="0" w:color="auto"/>
+              <w:right w:val="single" w:sz="6" w:space="0" w:color="auto"/>
+            </w:tcBorders>
+            <w:tcMar>
+              <w:top w:w="240" w:type="dxa"/>
+              <w:left w:w="0" w:type="dxa"/>
+              <w:bottom w:w="240" w:type="dxa"/>
+              <w:right w:w="180" w:type="dxa"/>
+            </w:tcMar>
+            <w:vAlign w:val="center"/>
+            <w:hideMark/>
+          </w:tcPr>
+          <w:p>
+            <w:pPr>
+              <w:spacing w:after="0" w:line="240" w:lineRule="auto"/>
+              <w:rPr>
+                <w:rFonts w:ascii="Arial" w:eastAsia="Times New Roman" w:hAnsi="Arial" w:cs="Arial"/>
+                <w:color w:val="1F1F1F"/>
+                <w:kern w:val="0"/>
+                <w:sz w:val="24"/>
+                <w:szCs w:val="24"/>
+                <w:lang w:eastAsia="en-IN"/>
+                <w14:ligatures w14:val="none"/>
+              </w:rPr>
+            </w:pPr>
+            <w:r>
+              <w:rPr>
+                <w:rFonts w:ascii="Arial" w:eastAsia="Times New Roman" w:hAnsi="Arial" w:cs="Arial"/>
+                <w:b/>
+                <w:bCs/>
+                <w:color w:val="1F1F1F"/>
+                <w:kern w:val="0"/>
+                <w:sz w:val="24"/>
+                <w:szCs w:val="24"/>
+                <w:bdr w:val="none" w:sz="0" w:space="0" w:color="auto" w:frame="1"/>
+                <w:lang w:eastAsia="en-IN"/>
+                <w14:ligatures w14:val="none"/>
+              </w:rPr>
+              <w:t>Horizontal Scaling</w:t>
+            </w:r>
+          </w:p>
+        </w:tc>
+        <w:tc>
+          <w:tcPr>
+            <w:tcW w:w="0" w:type="auto"/>
+            <w:tcBorders>
+              <w:top w:val="single" w:sz="6" w:space="0" w:color="auto"/>
+              <w:left w:val="single" w:sz="6" w:space="0" w:color="auto"/>
+              <w:bottom w:val="single" w:sz="6" w:space="0" w:color="auto"/>
+              <w:right w:val="single" w:sz="6" w:space="0" w:color="auto"/>
+            </w:tcBorders>
+            <w:tcMar>
+              <w:top w:w="240" w:type="dxa"/>
+              <w:left w:w="0" w:type="dxa"/>
+              <w:bottom w:w="240" w:type="dxa"/>
+              <w:right w:w="180" w:type="dxa"/>
+            </w:tcMar>
+            <w:vAlign w:val="center"/>
+            <w:hideMark/>
+          </w:tcPr>
+          <w:p>
+            <w:pPr>
+              <w:spacing w:after="0" w:line="240" w:lineRule="auto"/>
+              <w:rPr>
+                <w:rFonts w:ascii="Arial" w:eastAsia="Times New Roman" w:hAnsi="Arial" w:cs="Arial"/>
+                <w:color w:val="1F1F1F"/>
+                <w:kern w:val="0"/>
+                <w:lang w:eastAsia="en-IN"/>
+                <w14:ligatures w14:val="none"/>
+              </w:rPr>
+            </w:pPr>
+            <w:r>
+              <w:rPr>
+                <w:rFonts w:ascii="Arial" w:eastAsia="Times New Roman" w:hAnsi="Arial" w:cs="Arial"/>
+                <w:color w:val="1F1F1F"/>
+                <w:kern w:val="0"/>
+                <w:bdr w:val="none" w:sz="0" w:space="0" w:color="auto" w:frame="1"/>
+                <w:lang w:eastAsia="en-IN"/>
+                <w14:ligatures w14:val="none"/>
+              </w:rPr>
+              <w:t>No (Single node)</w:t>
+            </w:r>
+          </w:p>
+        </w:tc>
+        <w:tc>
+          <w:tcPr>
+            <w:tcW w:w="1464" w:type="dxa"/>
+            <w:tcBorders>
+              <w:top w:val="single" w:sz="6" w:space="0" w:color="auto"/>
+              <w:left w:val="single" w:sz="6" w:space="0" w:color="auto"/>
+              <w:bottom w:val="single" w:sz="6" w:space="0" w:color="auto"/>
+              <w:right w:val="single" w:sz="6" w:space="0" w:color="auto"/>
+            </w:tcBorders>
+            <w:tcMar>
+              <w:top w:w="240" w:type="dxa"/>
+              <w:left w:w="0" w:type="dxa"/>
+              <w:bottom w:w="240" w:type="dxa"/>
+              <w:right w:w="180" w:type="dxa"/>
+            </w:tcMar>
+            <w:vAlign w:val="center"/>
+            <w:hideMark/>
+          </w:tcPr>
+          <w:p>
+            <w:pPr>
+              <w:spacing w:after="0" w:line="240" w:lineRule="auto"/>
+              <w:rPr>
+                <w:rFonts w:ascii="Arial" w:eastAsia="Times New Roman" w:hAnsi="Arial" w:cs="Arial"/>
+                <w:color w:val="1F1F1F"/>
+                <w:kern w:val="0"/>
+                <w:lang w:eastAsia="en-IN"/>
+                <w14:ligatures w14:val="none"/>
+              </w:rPr>
+            </w:pPr>
+            <w:r>
+              <w:rPr>
+                <w:rFonts w:ascii="Arial" w:eastAsia="Times New Roman" w:hAnsi="Arial" w:cs="Arial"/>
+                <w:color w:val="1F1F1F"/>
+                <w:kern w:val="0"/>
+                <w:bdr w:val="none" w:sz="0" w:space="0" w:color="auto" w:frame="1"/>
+                <w:lang w:eastAsia="en-IN"/>
+                <w14:ligatures w14:val="none"/>
+              </w:rPr>
+              <w:t>Limited (Local)</w:t>
+            </w:r>
+          </w:p>
+        </w:tc>
+        <w:tc>
+          <w:tcPr>
+            <w:tcW w:w="1396" w:type="dxa"/>
+            <w:tcBorders>
+              <w:top w:val="single" w:sz="6" w:space="0" w:color="auto"/>
+              <w:left w:val="single" w:sz="6" w:space="0" w:color="auto"/>
+              <w:bottom w:val="single" w:sz="6" w:space="0" w:color="auto"/>
+              <w:right w:val="single" w:sz="6" w:space="0" w:color="auto"/>
+            </w:tcBorders>
+            <w:tcMar>
+              <w:top w:w="240" w:type="dxa"/>
+              <w:left w:w="0" w:type="dxa"/>
+              <w:bottom w:w="240" w:type="dxa"/>
+              <w:right w:w="180" w:type="dxa"/>
+            </w:tcMar>
+            <w:vAlign w:val="center"/>
+            <w:hideMark/>
+          </w:tcPr>
+          <w:p>
+            <w:pPr>
+              <w:spacing w:after="0" w:line="240" w:lineRule="auto"/>
+              <w:rPr>
+                <w:rFonts w:ascii="Arial" w:eastAsia="Times New Roman" w:hAnsi="Arial" w:cs="Arial"/>
+                <w:color w:val="1F1F1F"/>
+                <w:kern w:val="0"/>
+                <w:lang w:eastAsia="en-IN"/>
+                <w14:ligatures w14:val="none"/>
+              </w:rPr>
+            </w:pPr>
+            <w:r>
+              <w:rPr>
+                <w:rFonts w:ascii="Arial" w:eastAsia="Times New Roman" w:hAnsi="Arial" w:cs="Arial"/>
+                <w:color w:val="1F1F1F"/>
+                <w:kern w:val="0"/>
+                <w:bdr w:val="none" w:sz="0" w:space="0" w:color="auto" w:frame="1"/>
+                <w:lang w:eastAsia="en-IN"/>
+                <w14:ligatures w14:val="none"/>
+              </w:rPr>
+              <w:t>Excellent (Serverless)</w:t>
+            </w:r>
+          </w:p>
+        </w:tc>
+        <w:tc>
+          <w:tcPr>
+            <w:tcW w:w="1639" w:type="dxa"/>
+            <w:tcBorders>
+              <w:top w:val="single" w:sz="6" w:space="0" w:color="auto"/>
+              <w:left w:val="single" w:sz="6" w:space="0" w:color="auto"/>
+              <w:bottom w:val="single" w:sz="6" w:space="0" w:color="auto"/>
+              <w:right w:val="single" w:sz="6" w:space="0" w:color="auto"/>
+            </w:tcBorders>
+            <w:tcMar>
+              <w:top w:w="240" w:type="dxa"/>
+              <w:left w:w="0" w:type="dxa"/>
+              <w:bottom w:w="240" w:type="dxa"/>
+              <w:right w:w="180" w:type="dxa"/>
+            </w:tcMar>
+            <w:vAlign w:val="center"/>
+            <w:hideMark/>
+          </w:tcPr>
+          <w:p>
+            <w:pPr>
+              <w:spacing w:after="0" w:line="240" w:lineRule="auto"/>
+              <w:rPr>
+                <w:rFonts w:ascii="Arial" w:eastAsia="Times New Roman" w:hAnsi="Arial" w:cs="Arial"/>
+                <w:color w:val="1F1F1F"/>
+                <w:kern w:val="0"/>
+                <w:lang w:eastAsia="en-IN"/>
+                <w14:ligatures w14:val="none"/>
+              </w:rPr>
+            </w:pPr>
+            <w:r>
+              <w:rPr>
+                <w:rFonts w:ascii="Arial" w:eastAsia="Times New Roman" w:hAnsi="Arial" w:cs="Arial"/>
+                <w:color w:val="1F1F1F"/>
+                <w:kern w:val="0"/>
+                <w:bdr w:val="none" w:sz="0" w:space="0" w:color="auto" w:frame="1"/>
+                <w:lang w:eastAsia="en-IN"/>
+                <w14:ligatures w14:val="none"/>
+              </w:rPr>
+              <w:t>Good (Clustered)</w:t>
+            </w:r>
+          </w:p>
+        </w:tc>
+        <w:tc>
+          <w:tcPr>
+            <w:tcW w:w="1602" w:type="dxa"/>
+            <w:tcBorders>
+              <w:top w:val="single" w:sz="6" w:space="0" w:color="auto"/>
+              <w:left w:val="single" w:sz="6" w:space="0" w:color="auto"/>
+              <w:bottom w:val="single" w:sz="6" w:space="0" w:color="auto"/>
+              <w:right w:val="single" w:sz="6" w:space="0" w:color="auto"/>
+            </w:tcBorders>
+            <w:tcMar>
+              <w:top w:w="240" w:type="dxa"/>
+              <w:left w:w="0" w:type="dxa"/>
+              <w:bottom w:w="240" w:type="dxa"/>
+              <w:right w:w="0" w:type="dxa"/>
+            </w:tcMar>
+            <w:vAlign w:val="center"/>
+            <w:hideMark/>
+          </w:tcPr>
+          <w:p>
+            <w:pPr>
+              <w:spacing w:after="0" w:line="240" w:lineRule="auto"/>
+              <w:rPr>
+                <w:rFonts w:ascii="Arial" w:eastAsia="Times New Roman" w:hAnsi="Arial" w:cs="Arial"/>
+                <w:color w:val="1F1F1F"/>
+                <w:kern w:val="0"/>
+                <w:lang w:eastAsia="en-IN"/>
+                <w14:ligatures w14:val="none"/>
+              </w:rPr>
+            </w:pPr>
+            <w:r>
+              <w:rPr>
+                <w:rFonts w:ascii="Arial" w:eastAsia="Times New Roman" w:hAnsi="Arial" w:cs="Arial"/>
+                <w:b/>
+                <w:bCs/>
+                <w:color w:val="1F1F1F"/>
+                <w:kern w:val="0"/>
+                <w:bdr w:val="none" w:sz="0" w:space="0" w:color="auto" w:frame="1"/>
+                <w:lang w:eastAsia="en-IN"/>
+                <w14:ligatures w14:val="none"/>
+              </w:rPr>
+              <w:t>Extreme (Billion+)</w:t>
+            </w:r>
+          </w:p>
+        </w:tc>
+      </w:tr>
+      <w:tr>
+        <w:trPr>
+          <w:tblCellSpacing w:w="15" w:type="dxa"/>
+        </w:trPr>
+        <w:tc>
+          <w:tcPr>
+            <w:tcW w:w="0" w:type="auto"/>
+            <w:tcBorders>
+              <w:top w:val="single" w:sz="6" w:space="0" w:color="auto"/>
+              <w:left w:val="single" w:sz="6" w:space="0" w:color="auto"/>
+              <w:bottom w:val="single" w:sz="6" w:space="0" w:color="auto"/>
+              <w:right w:val="single" w:sz="6" w:space="0" w:color="auto"/>
+            </w:tcBorders>
+            <w:tcMar>
+              <w:top w:w="240" w:type="dxa"/>
+              <w:left w:w="0" w:type="dxa"/>
+              <w:bottom w:w="240" w:type="dxa"/>
+              <w:right w:w="180" w:type="dxa"/>
+            </w:tcMar>
+            <w:vAlign w:val="center"/>
+            <w:hideMark/>
+          </w:tcPr>
+          <w:p>
+            <w:pPr>
+              <w:spacing w:after="0" w:line="240" w:lineRule="auto"/>
+              <w:rPr>
+                <w:rFonts w:ascii="Arial" w:eastAsia="Times New Roman" w:hAnsi="Arial" w:cs="Arial"/>
+                <w:color w:val="1F1F1F"/>
+                <w:kern w:val="0"/>
+                <w:sz w:val="24"/>
+                <w:szCs w:val="24"/>
+                <w:lang w:eastAsia="en-IN"/>
+                <w14:ligatures w14:val="none"/>
+              </w:rPr>
+            </w:pPr>
+            <w:r>
+              <w:rPr>
+                <w:rFonts w:ascii="Arial" w:eastAsia="Times New Roman" w:hAnsi="Arial" w:cs="Arial"/>
+                <w:b/>
+                <w:bCs/>
+                <w:color w:val="1F1F1F"/>
+                <w:kern w:val="0"/>
+                <w:sz w:val="24"/>
+                <w:szCs w:val="24"/>
+                <w:bdr w:val="none" w:sz="0" w:space="0" w:color="auto" w:frame="1"/>
+                <w:lang w:eastAsia="en-IN"/>
+                <w14:ligatures w14:val="none"/>
+              </w:rPr>
+              <w:t>Memory Efficiency</w:t>
+            </w:r>
+          </w:p>
+        </w:tc>
+        <w:tc>
+          <w:tcPr>
+            <w:tcW w:w="0" w:type="auto"/>
+            <w:tcBorders>
+              <w:top w:val="single" w:sz="6" w:space="0" w:color="auto"/>
+              <w:left w:val="single" w:sz="6" w:space="0" w:color="auto"/>
+              <w:bottom w:val="single" w:sz="6" w:space="0" w:color="auto"/>
+              <w:right w:val="single" w:sz="6" w:space="0" w:color="auto"/>
+            </w:tcBorders>
+            <w:tcMar>
+              <w:top w:w="240" w:type="dxa"/>
+              <w:left w:w="0" w:type="dxa"/>
+              <w:bottom w:w="240" w:type="dxa"/>
+              <w:right w:w="180" w:type="dxa"/>
+            </w:tcMar>
+            <w:vAlign w:val="center"/>
+            <w:hideMark/>
+          </w:tcPr>
+          <w:p>
+            <w:pPr>
+              <w:spacing w:after="0" w:line="240" w:lineRule="auto"/>
+              <w:rPr>
+                <w:rFonts w:ascii="Arial" w:eastAsia="Times New Roman" w:hAnsi="Arial" w:cs="Arial"/>
+                <w:color w:val="1F1F1F"/>
+                <w:kern w:val="0"/>
+                <w:lang w:eastAsia="en-IN"/>
+                <w14:ligatures w14:val="none"/>
+              </w:rPr>
+            </w:pPr>
+            <w:r>
+              <w:rPr>
+                <w:rFonts w:ascii="Arial" w:eastAsia="Times New Roman" w:hAnsi="Arial" w:cs="Arial"/>
+                <w:color w:val="1F1F1F"/>
+                <w:kern w:val="0"/>
+                <w:bdr w:val="none" w:sz="0" w:space="0" w:color="auto" w:frame="1"/>
+                <w:lang w:eastAsia="en-IN"/>
+                <w14:ligatures w14:val="none"/>
+              </w:rPr>
+              <w:t>High (via PQ/IVF)</w:t>
+            </w:r>
+          </w:p>
+        </w:tc>
+        <w:tc>
+          <w:tcPr>
+            <w:tcW w:w="1464" w:type="dxa"/>
+            <w:tcBorders>
+              <w:top w:val="single" w:sz="6" w:space="0" w:color="auto"/>
+              <w:left w:val="single" w:sz="6" w:space="0" w:color="auto"/>
+              <w:bottom w:val="single" w:sz="6" w:space="0" w:color="auto"/>
+              <w:right w:val="single" w:sz="6" w:space="0" w:color="auto"/>
+            </w:tcBorders>
+            <w:tcMar>
+              <w:top w:w="240" w:type="dxa"/>
+              <w:left w:w="0" w:type="dxa"/>
+              <w:bottom w:w="240" w:type="dxa"/>
+              <w:right w:w="180" w:type="dxa"/>
+            </w:tcMar>
+            <w:vAlign w:val="center"/>
+            <w:hideMark/>
+          </w:tcPr>
+          <w:p>
+            <w:pPr>
+              <w:spacing w:after="0" w:line="240" w:lineRule="auto"/>
+              <w:rPr>
+                <w:rFonts w:ascii="Arial" w:eastAsia="Times New Roman" w:hAnsi="Arial" w:cs="Arial"/>
+                <w:color w:val="1F1F1F"/>
+                <w:kern w:val="0"/>
+                <w:lang w:eastAsia="en-IN"/>
+                <w14:ligatures w14:val="none"/>
+              </w:rPr>
+            </w:pPr>
+            <w:r>
+              <w:rPr>
+                <w:rFonts w:ascii="Arial" w:eastAsia="Times New Roman" w:hAnsi="Arial" w:cs="Arial"/>
+                <w:color w:val="1F1F1F"/>
+                <w:kern w:val="0"/>
+                <w:bdr w:val="none" w:sz="0" w:space="0" w:color="auto" w:frame="1"/>
+                <w:lang w:eastAsia="en-IN"/>
+                <w14:ligatures w14:val="none"/>
+              </w:rPr>
+              <w:t>Low (RAM hungry)</w:t>
+            </w:r>
+          </w:p>
+        </w:tc>
+        <w:tc>
+          <w:tcPr>
+            <w:tcW w:w="1396" w:type="dxa"/>
+            <w:tcBorders>
+              <w:top w:val="single" w:sz="6" w:space="0" w:color="auto"/>
+              <w:left w:val="single" w:sz="6" w:space="0" w:color="auto"/>
+              <w:bottom w:val="single" w:sz="6" w:space="0" w:color="auto"/>
+              <w:right w:val="single" w:sz="6" w:space="0" w:color="auto"/>
+            </w:tcBorders>
+            <w:tcMar>
+              <w:top w:w="240" w:type="dxa"/>
+              <w:left w:w="0" w:type="dxa"/>
+              <w:bottom w:w="240" w:type="dxa"/>
+              <w:right w:w="180" w:type="dxa"/>
+            </w:tcMar>
+            <w:vAlign w:val="center"/>
+            <w:hideMark/>
+          </w:tcPr>
+          <w:p>
+            <w:pPr>
+              <w:spacing w:after="0" w:line="240" w:lineRule="auto"/>
+              <w:rPr>
+                <w:rFonts w:ascii="Arial" w:eastAsia="Times New Roman" w:hAnsi="Arial" w:cs="Arial"/>
+                <w:color w:val="1F1F1F"/>
+                <w:kern w:val="0"/>
+                <w:lang w:eastAsia="en-IN"/>
+                <w14:ligatures w14:val="none"/>
+              </w:rPr>
+            </w:pPr>
+            <w:r>
+              <w:rPr>
+                <w:rFonts w:ascii="Arial" w:eastAsia="Times New Roman" w:hAnsi="Arial" w:cs="Arial"/>
+                <w:color w:val="1F1F1F"/>
+                <w:kern w:val="0"/>
+                <w:bdr w:val="none" w:sz="0" w:space="0" w:color="auto" w:frame="1"/>
+                <w:lang w:eastAsia="en-IN"/>
+                <w14:ligatures w14:val="none"/>
+              </w:rPr>
+              <w:t>Managed by Cloud</w:t>
+            </w:r>
+          </w:p>
+        </w:tc>
+        <w:tc>
+          <w:tcPr>
+            <w:tcW w:w="1639" w:type="dxa"/>
+            <w:tcBorders>
+              <w:top w:val="single" w:sz="6" w:space="0" w:color="auto"/>
+              <w:left w:val="single" w:sz="6" w:space="0" w:color="auto"/>
+              <w:bottom w:val="single" w:sz="6" w:space="0" w:color="auto"/>
+              <w:right w:val="single" w:sz="6" w:space="0" w:color="auto"/>
+            </w:tcBorders>
+            <w:tcMar>
+              <w:top w:w="240" w:type="dxa"/>
+              <w:left w:w="0" w:type="dxa"/>
+              <w:bottom w:w="240" w:type="dxa"/>
+              <w:right w:w="180" w:type="dxa"/>
+            </w:tcMar>
+            <w:vAlign w:val="center"/>
+            <w:hideMark/>
+          </w:tcPr>
+          <w:p>
+            <w:pPr>
+              <w:spacing w:after="0" w:line="240" w:lineRule="auto"/>
+              <w:rPr>
+                <w:rFonts w:ascii="Arial" w:eastAsia="Times New Roman" w:hAnsi="Arial" w:cs="Arial"/>
+                <w:color w:val="1F1F1F"/>
+                <w:kern w:val="0"/>
+                <w:lang w:eastAsia="en-IN"/>
+                <w14:ligatures w14:val="none"/>
+              </w:rPr>
+            </w:pPr>
+            <w:r>
+              <w:rPr>
+                <w:rFonts w:ascii="Arial" w:eastAsia="Times New Roman" w:hAnsi="Arial" w:cs="Arial"/>
+                <w:b/>
+                <w:bCs/>
+                <w:color w:val="1F1F1F"/>
+                <w:kern w:val="0"/>
+                <w:bdr w:val="none" w:sz="0" w:space="0" w:color="auto" w:frame="1"/>
+                <w:lang w:eastAsia="en-IN"/>
+                <w14:ligatures w14:val="none"/>
+              </w:rPr>
+              <w:t>High (Disk/RAM)</w:t>
+            </w:r>
+          </w:p>
+        </w:tc>
+        <w:tc>
+          <w:tcPr>
+            <w:tcW w:w="1602" w:type="dxa"/>
+            <w:tcBorders>
+              <w:top w:val="single" w:sz="6" w:space="0" w:color="auto"/>
+              <w:left w:val="single" w:sz="6" w:space="0" w:color="auto"/>
+              <w:bottom w:val="single" w:sz="6" w:space="0" w:color="auto"/>
+              <w:right w:val="single" w:sz="6" w:space="0" w:color="auto"/>
+            </w:tcBorders>
+            <w:tcMar>
+              <w:top w:w="240" w:type="dxa"/>
+              <w:left w:w="0" w:type="dxa"/>
+              <w:bottom w:w="240" w:type="dxa"/>
+              <w:right w:w="0" w:type="dxa"/>
+            </w:tcMar>
+            <w:vAlign w:val="center"/>
+            <w:hideMark/>
+          </w:tcPr>
+          <w:p>
+            <w:pPr>
+              <w:spacing w:after="0" w:line="240" w:lineRule="auto"/>
+              <w:rPr>
+                <w:rFonts w:ascii="Arial" w:eastAsia="Times New Roman" w:hAnsi="Arial" w:cs="Arial"/>
+                <w:color w:val="1F1F1F"/>
+                <w:kern w:val="0"/>
+                <w:lang w:eastAsia="en-IN"/>
+                <w14:ligatures w14:val="none"/>
+              </w:rPr>
+            </w:pPr>
+            <w:r>
+              <w:rPr>
+                <w:rFonts w:ascii="Arial" w:eastAsia="Times New Roman" w:hAnsi="Arial" w:cs="Arial"/>
+                <w:color w:val="1F1F1F"/>
+                <w:kern w:val="0"/>
+                <w:bdr w:val="none" w:sz="0" w:space="0" w:color="auto" w:frame="1"/>
+                <w:lang w:eastAsia="en-IN"/>
+                <w14:ligatures w14:val="none"/>
+              </w:rPr>
+              <w:t>Best (Disk-Optimized)</w:t>
+            </w:r>
+          </w:p>
+        </w:tc>
+      </w:tr>
+      <w:tr>
+        <w:trPr>
+          <w:tblCellSpacing w:w="15" w:type="dxa"/>
+        </w:trPr>
+        <w:tc>
+          <w:tcPr>
+            <w:tcW w:w="0" w:type="auto"/>
+            <w:tcBorders>
+              <w:top w:val="single" w:sz="6" w:space="0" w:color="auto"/>
+              <w:left w:val="single" w:sz="6" w:space="0" w:color="auto"/>
+              <w:bottom w:val="single" w:sz="6" w:space="0" w:color="auto"/>
+              <w:right w:val="single" w:sz="6" w:space="0" w:color="auto"/>
+            </w:tcBorders>
+            <w:tcMar>
+              <w:top w:w="240" w:type="dxa"/>
+              <w:left w:w="0" w:type="dxa"/>
+              <w:bottom w:w="240" w:type="dxa"/>
+              <w:right w:w="180" w:type="dxa"/>
+            </w:tcMar>
+            <w:vAlign w:val="center"/>
+            <w:hideMark/>
+          </w:tcPr>
+          <w:p>
+            <w:pPr>
+              <w:spacing w:after="0" w:line="240" w:lineRule="auto"/>
+              <w:rPr>
+                <w:rFonts w:ascii="Arial" w:eastAsia="Times New Roman" w:hAnsi="Arial" w:cs="Arial"/>
+                <w:color w:val="1F1F1F"/>
+                <w:kern w:val="0"/>
+                <w:sz w:val="24"/>
+                <w:szCs w:val="24"/>
+                <w:lang w:eastAsia="en-IN"/>
+                <w14:ligatures w14:val="none"/>
+              </w:rPr>
+            </w:pPr>
+            <w:r>
+              <w:rPr>
+                <w:rFonts w:ascii="Arial" w:eastAsia="Times New Roman" w:hAnsi="Arial" w:cs="Arial"/>
+                <w:b/>
+                <w:bCs/>
+                <w:color w:val="1F1F1F"/>
+                <w:kern w:val="0"/>
+                <w:sz w:val="24"/>
+                <w:szCs w:val="24"/>
+                <w:bdr w:val="none" w:sz="0" w:space="0" w:color="auto" w:frame="1"/>
+                <w:lang w:eastAsia="en-IN"/>
+                <w14:ligatures w14:val="none"/>
+              </w:rPr>
+              <w:t>Language Support</w:t>
+            </w:r>
+          </w:p>
+        </w:tc>
+        <w:tc>
+          <w:tcPr>
+            <w:tcW w:w="0" w:type="auto"/>
+            <w:tcBorders>
+              <w:top w:val="single" w:sz="6" w:space="0" w:color="auto"/>
+              <w:left w:val="single" w:sz="6" w:space="0" w:color="auto"/>
+              <w:bottom w:val="single" w:sz="6" w:space="0" w:color="auto"/>
+              <w:right w:val="single" w:sz="6" w:space="0" w:color="auto"/>
+            </w:tcBorders>
+            <w:tcMar>
+              <w:top w:w="240" w:type="dxa"/>
+              <w:left w:w="0" w:type="dxa"/>
+              <w:bottom w:w="240" w:type="dxa"/>
+              <w:right w:w="180" w:type="dxa"/>
+            </w:tcMar>
+            <w:vAlign w:val="center"/>
+            <w:hideMark/>
+          </w:tcPr>
+          <w:p>
+            <w:pPr>
+              <w:spacing w:after="0" w:line="240" w:lineRule="auto"/>
+              <w:rPr>
+                <w:rFonts w:ascii="Arial" w:eastAsia="Times New Roman" w:hAnsi="Arial" w:cs="Arial"/>
+                <w:color w:val="1F1F1F"/>
+                <w:kern w:val="0"/>
+                <w:lang w:eastAsia="en-IN"/>
+                <w14:ligatures w14:val="none"/>
+              </w:rPr>
+            </w:pPr>
+            <w:r>
+              <w:rPr>
+                <w:rFonts w:ascii="Arial" w:eastAsia="Times New Roman" w:hAnsi="Arial" w:cs="Arial"/>
+                <w:color w:val="1F1F1F"/>
+                <w:kern w:val="0"/>
+                <w:bdr w:val="none" w:sz="0" w:space="0" w:color="auto" w:frame="1"/>
+                <w:lang w:eastAsia="en-IN"/>
+                <w14:ligatures w14:val="none"/>
+              </w:rPr>
+              <w:t>C++, Python</w:t>
+            </w:r>
+          </w:p>
+        </w:tc>
+        <w:tc>
+          <w:tcPr>
+            <w:tcW w:w="1464" w:type="dxa"/>
+            <w:tcBorders>
+              <w:top w:val="single" w:sz="6" w:space="0" w:color="auto"/>
+              <w:left w:val="single" w:sz="6" w:space="0" w:color="auto"/>
+              <w:bottom w:val="single" w:sz="6" w:space="0" w:color="auto"/>
+              <w:right w:val="single" w:sz="6" w:space="0" w:color="auto"/>
+            </w:tcBorders>
+            <w:tcMar>
+              <w:top w:w="240" w:type="dxa"/>
+              <w:left w:w="0" w:type="dxa"/>
+              <w:bottom w:w="240" w:type="dxa"/>
+              <w:right w:w="180" w:type="dxa"/>
+            </w:tcMar>
+            <w:vAlign w:val="center"/>
+            <w:hideMark/>
+          </w:tcPr>
+          <w:p>
+            <w:pPr>
+              <w:spacing w:after="0" w:line="240" w:lineRule="auto"/>
+              <w:rPr>
+                <w:rFonts w:ascii="Arial" w:eastAsia="Times New Roman" w:hAnsi="Arial" w:cs="Arial"/>
+                <w:color w:val="1F1F1F"/>
+                <w:kern w:val="0"/>
+                <w:lang w:eastAsia="en-IN"/>
+                <w14:ligatures w14:val="none"/>
+              </w:rPr>
+            </w:pPr>
+            <w:r>
+              <w:rPr>
+                <w:rFonts w:ascii="Arial" w:eastAsia="Times New Roman" w:hAnsi="Arial" w:cs="Arial"/>
+                <w:color w:val="1F1F1F"/>
+                <w:kern w:val="0"/>
+                <w:bdr w:val="none" w:sz="0" w:space="0" w:color="auto" w:frame="1"/>
+                <w:lang w:eastAsia="en-IN"/>
+                <w14:ligatures w14:val="none"/>
+              </w:rPr>
+              <w:t>Python, JS/TS</w:t>
+            </w:r>
+          </w:p>
+        </w:tc>
+        <w:tc>
+          <w:tcPr>
+            <w:tcW w:w="1396" w:type="dxa"/>
+            <w:tcBorders>
+              <w:top w:val="single" w:sz="6" w:space="0" w:color="auto"/>
+              <w:left w:val="single" w:sz="6" w:space="0" w:color="auto"/>
+              <w:bottom w:val="single" w:sz="6" w:space="0" w:color="auto"/>
+              <w:right w:val="single" w:sz="6" w:space="0" w:color="auto"/>
+            </w:tcBorders>
+            <w:tcMar>
+              <w:top w:w="240" w:type="dxa"/>
+              <w:left w:w="0" w:type="dxa"/>
+              <w:bottom w:w="240" w:type="dxa"/>
+              <w:right w:w="180" w:type="dxa"/>
+            </w:tcMar>
+            <w:vAlign w:val="center"/>
+            <w:hideMark/>
+          </w:tcPr>
+          <w:p>
+            <w:pPr>
+              <w:spacing w:after="0" w:line="240" w:lineRule="auto"/>
+              <w:rPr>
+                <w:rFonts w:ascii="Arial" w:eastAsia="Times New Roman" w:hAnsi="Arial" w:cs="Arial"/>
+                <w:color w:val="1F1F1F"/>
+                <w:kern w:val="0"/>
+                <w:lang w:eastAsia="en-IN"/>
+                <w14:ligatures w14:val="none"/>
+              </w:rPr>
+            </w:pPr>
+            <w:r>
+              <w:rPr>
+                <w:rFonts w:ascii="Arial" w:eastAsia="Times New Roman" w:hAnsi="Arial" w:cs="Arial"/>
+                <w:color w:val="1F1F1F"/>
+                <w:kern w:val="0"/>
+                <w:bdr w:val="none" w:sz="0" w:space="0" w:color="auto" w:frame="1"/>
+                <w:lang w:eastAsia="en-IN"/>
+                <w14:ligatures w14:val="none"/>
+              </w:rPr>
+              <w:t>All (REST API)</w:t>
+            </w:r>
+          </w:p>
+        </w:tc>
+        <w:tc>
+          <w:tcPr>
+            <w:tcW w:w="1639" w:type="dxa"/>
+            <w:tcBorders>
+              <w:top w:val="single" w:sz="6" w:space="0" w:color="auto"/>
+              <w:left w:val="single" w:sz="6" w:space="0" w:color="auto"/>
+              <w:bottom w:val="single" w:sz="6" w:space="0" w:color="auto"/>
+              <w:right w:val="single" w:sz="6" w:space="0" w:color="auto"/>
+            </w:tcBorders>
+            <w:tcMar>
+              <w:top w:w="240" w:type="dxa"/>
+              <w:left w:w="0" w:type="dxa"/>
+              <w:bottom w:w="240" w:type="dxa"/>
+              <w:right w:w="180" w:type="dxa"/>
+            </w:tcMar>
+            <w:vAlign w:val="center"/>
+            <w:hideMark/>
+          </w:tcPr>
+          <w:p>
+            <w:pPr>
+              <w:spacing w:after="0" w:line="240" w:lineRule="auto"/>
+              <w:rPr>
+                <w:rFonts w:ascii="Arial" w:eastAsia="Times New Roman" w:hAnsi="Arial" w:cs="Arial"/>
+                <w:color w:val="1F1F1F"/>
+                <w:kern w:val="0"/>
+                <w:lang w:eastAsia="en-IN"/>
+                <w14:ligatures w14:val="none"/>
+              </w:rPr>
+            </w:pPr>
+            <w:r>
+              <w:rPr>
+                <w:rFonts w:ascii="Arial" w:eastAsia="Times New Roman" w:hAnsi="Arial" w:cs="Arial"/>
+                <w:color w:val="1F1F1F"/>
+                <w:kern w:val="0"/>
+                <w:bdr w:val="none" w:sz="0" w:space="0" w:color="auto" w:frame="1"/>
+                <w:lang w:eastAsia="en-IN"/>
+                <w14:ligatures w14:val="none"/>
+              </w:rPr>
+              <w:t>Python, Rust, Go, Java</w:t>
+            </w:r>
+          </w:p>
+        </w:tc>
+        <w:tc>
+          <w:tcPr>
+            <w:tcW w:w="1602" w:type="dxa"/>
+            <w:tcBorders>
+              <w:top w:val="single" w:sz="6" w:space="0" w:color="auto"/>
+              <w:left w:val="single" w:sz="6" w:space="0" w:color="auto"/>
+              <w:bottom w:val="single" w:sz="6" w:space="0" w:color="auto"/>
+              <w:right w:val="single" w:sz="6" w:space="0" w:color="auto"/>
+            </w:tcBorders>
+            <w:tcMar>
+              <w:top w:w="240" w:type="dxa"/>
+              <w:left w:w="0" w:type="dxa"/>
+              <w:bottom w:w="240" w:type="dxa"/>
+              <w:right w:w="0" w:type="dxa"/>
+            </w:tcMar>
+            <w:vAlign w:val="center"/>
+            <w:hideMark/>
+          </w:tcPr>
+          <w:p>
+            <w:pPr>
+              <w:spacing w:after="0" w:line="240" w:lineRule="auto"/>
+              <w:rPr>
+                <w:rFonts w:ascii="Arial" w:eastAsia="Times New Roman" w:hAnsi="Arial" w:cs="Arial"/>
+                <w:color w:val="1F1F1F"/>
+                <w:kern w:val="0"/>
+                <w:lang w:eastAsia="en-IN"/>
+                <w14:ligatures w14:val="none"/>
+              </w:rPr>
+            </w:pPr>
+            <w:r>
+              <w:rPr>
+                <w:rFonts w:ascii="Arial" w:eastAsia="Times New Roman" w:hAnsi="Arial" w:cs="Arial"/>
+                <w:color w:val="1F1F1F"/>
+                <w:kern w:val="0"/>
+                <w:bdr w:val="none" w:sz="0" w:space="0" w:color="auto" w:frame="1"/>
+                <w:lang w:eastAsia="en-IN"/>
+                <w14:ligatures w14:val="none"/>
+              </w:rPr>
+              <w:t>All (</w:t>
+            </w:r>
+            <w:proofErr w:type="spellStart"/>
+            <w:r>
+              <w:rPr>
+                <w:rFonts w:ascii="Arial" w:eastAsia="Times New Roman" w:hAnsi="Arial" w:cs="Arial"/>
+                <w:color w:val="1F1F1F"/>
+                <w:kern w:val="0"/>
+                <w:bdr w:val="none" w:sz="0" w:space="0" w:color="auto" w:frame="1"/>
+                <w:lang w:eastAsia="en-IN"/>
+                <w14:ligatures w14:val="none"/>
+              </w:rPr>
+              <w:t>gRPC</w:t>
+            </w:r>
+            <w:proofErr w:type="spellEnd"/>
+            <w:r>
+              <w:rPr>
+                <w:rFonts w:ascii="Arial" w:eastAsia="Times New Roman" w:hAnsi="Arial" w:cs="Arial"/>
+                <w:color w:val="1F1F1F"/>
+                <w:kern w:val="0"/>
+                <w:bdr w:val="none" w:sz="0" w:space="0" w:color="auto" w:frame="1"/>
+                <w:lang w:eastAsia="en-IN"/>
+                <w14:ligatures w14:val="none"/>
+              </w:rPr>
+              <w:t>/REST)</w:t>
+            </w:r>
+          </w:p>
+        </w:tc>
+      </w:tr>
+      <w:tr>
+        <w:trPr>
+          <w:tblCellSpacing w:w="15" w:type="dxa"/>
+        </w:trPr>
+        <w:tc>
+          <w:tcPr>
+            <w:tcW w:w="0" w:type="auto"/>
+            <w:tcBorders>
+              <w:top w:val="single" w:sz="6" w:space="0" w:color="auto"/>
+              <w:left w:val="single" w:sz="6" w:space="0" w:color="auto"/>
+              <w:bottom w:val="single" w:sz="6" w:space="0" w:color="auto"/>
+              <w:right w:val="single" w:sz="6" w:space="0" w:color="auto"/>
+            </w:tcBorders>
+            <w:tcMar>
+              <w:top w:w="240" w:type="dxa"/>
+              <w:left w:w="0" w:type="dxa"/>
+              <w:bottom w:w="240" w:type="dxa"/>
+              <w:right w:w="180" w:type="dxa"/>
+            </w:tcMar>
+            <w:vAlign w:val="center"/>
+            <w:hideMark/>
+          </w:tcPr>
+          <w:p>
+            <w:pPr>
+              <w:spacing w:after="0" w:line="240" w:lineRule="auto"/>
+              <w:rPr>
+                <w:rFonts w:ascii="Arial" w:eastAsia="Times New Roman" w:hAnsi="Arial" w:cs="Arial"/>
+                <w:color w:val="1F1F1F"/>
+                <w:kern w:val="0"/>
+                <w:sz w:val="24"/>
+                <w:szCs w:val="24"/>
+                <w:lang w:eastAsia="en-IN"/>
+                <w14:ligatures w14:val="none"/>
+              </w:rPr>
+            </w:pPr>
+            <w:r>
+              <w:rPr>
+                <w:rFonts w:ascii="Arial" w:eastAsia="Times New Roman" w:hAnsi="Arial" w:cs="Arial"/>
+                <w:b/>
+                <w:bCs/>
+                <w:color w:val="1F1F1F"/>
+                <w:kern w:val="0"/>
+                <w:sz w:val="24"/>
+                <w:szCs w:val="24"/>
+                <w:bdr w:val="none" w:sz="0" w:space="0" w:color="auto" w:frame="1"/>
+                <w:lang w:eastAsia="en-IN"/>
+                <w14:ligatures w14:val="none"/>
+              </w:rPr>
+              <w:t>Best Advantage</w:t>
+            </w:r>
+          </w:p>
+        </w:tc>
+        <w:tc>
+          <w:tcPr>
+            <w:tcW w:w="0" w:type="auto"/>
+            <w:tcBorders>
+              <w:top w:val="single" w:sz="6" w:space="0" w:color="auto"/>
+              <w:left w:val="single" w:sz="6" w:space="0" w:color="auto"/>
+              <w:bottom w:val="single" w:sz="6" w:space="0" w:color="auto"/>
+              <w:right w:val="single" w:sz="6" w:space="0" w:color="auto"/>
+            </w:tcBorders>
+            <w:tcMar>
+              <w:top w:w="240" w:type="dxa"/>
+              <w:left w:w="0" w:type="dxa"/>
+              <w:bottom w:w="240" w:type="dxa"/>
+              <w:right w:w="180" w:type="dxa"/>
+            </w:tcMar>
+            <w:vAlign w:val="center"/>
+            <w:hideMark/>
+          </w:tcPr>
+          <w:p>
+            <w:pPr>
+              <w:spacing w:after="0" w:line="240" w:lineRule="auto"/>
+              <w:rPr>
+                <w:rFonts w:ascii="Arial" w:eastAsia="Times New Roman" w:hAnsi="Arial" w:cs="Arial"/>
+                <w:color w:val="1F1F1F"/>
+                <w:kern w:val="0"/>
+                <w:lang w:eastAsia="en-IN"/>
+                <w14:ligatures w14:val="none"/>
+              </w:rPr>
+            </w:pPr>
+            <w:r>
+              <w:rPr>
+                <w:rFonts w:ascii="Arial" w:eastAsia="Times New Roman" w:hAnsi="Arial" w:cs="Arial"/>
+                <w:b/>
+                <w:bCs/>
+                <w:color w:val="1F1F1F"/>
+                <w:kern w:val="0"/>
+                <w:bdr w:val="none" w:sz="0" w:space="0" w:color="auto" w:frame="1"/>
+                <w:lang w:eastAsia="en-IN"/>
+                <w14:ligatures w14:val="none"/>
+              </w:rPr>
+              <w:t>Raw Math Speed.</w:t>
+            </w:r>
+          </w:p>
+        </w:tc>
+        <w:tc>
+          <w:tcPr>
+            <w:tcW w:w="1464" w:type="dxa"/>
+            <w:tcBorders>
+              <w:top w:val="single" w:sz="6" w:space="0" w:color="auto"/>
+              <w:left w:val="single" w:sz="6" w:space="0" w:color="auto"/>
+              <w:bottom w:val="single" w:sz="6" w:space="0" w:color="auto"/>
+              <w:right w:val="single" w:sz="6" w:space="0" w:color="auto"/>
+            </w:tcBorders>
+            <w:tcMar>
+              <w:top w:w="240" w:type="dxa"/>
+              <w:left w:w="0" w:type="dxa"/>
+              <w:bottom w:w="240" w:type="dxa"/>
+              <w:right w:w="180" w:type="dxa"/>
+            </w:tcMar>
+            <w:vAlign w:val="center"/>
+            <w:hideMark/>
+          </w:tcPr>
+          <w:p>
+            <w:pPr>
+              <w:spacing w:after="0" w:line="240" w:lineRule="auto"/>
+              <w:rPr>
+                <w:rFonts w:ascii="Arial" w:eastAsia="Times New Roman" w:hAnsi="Arial" w:cs="Arial"/>
+                <w:color w:val="1F1F1F"/>
+                <w:kern w:val="0"/>
+                <w:lang w:eastAsia="en-IN"/>
+                <w14:ligatures w14:val="none"/>
+              </w:rPr>
+            </w:pPr>
+            <w:r>
+              <w:rPr>
+                <w:rFonts w:ascii="Arial" w:eastAsia="Times New Roman" w:hAnsi="Arial" w:cs="Arial"/>
+                <w:b/>
+                <w:bCs/>
+                <w:color w:val="1F1F1F"/>
+                <w:kern w:val="0"/>
+                <w:bdr w:val="none" w:sz="0" w:space="0" w:color="auto" w:frame="1"/>
+                <w:lang w:eastAsia="en-IN"/>
+                <w14:ligatures w14:val="none"/>
+              </w:rPr>
+              <w:t>Simplicity.</w:t>
+            </w:r>
+          </w:p>
+        </w:tc>
+        <w:tc>
+          <w:tcPr>
+            <w:tcW w:w="1396" w:type="dxa"/>
+            <w:tcBorders>
+              <w:top w:val="single" w:sz="6" w:space="0" w:color="auto"/>
+              <w:left w:val="single" w:sz="6" w:space="0" w:color="auto"/>
+              <w:bottom w:val="single" w:sz="6" w:space="0" w:color="auto"/>
+              <w:right w:val="single" w:sz="6" w:space="0" w:color="auto"/>
+            </w:tcBorders>
+            <w:tcMar>
+              <w:top w:w="240" w:type="dxa"/>
+              <w:left w:w="0" w:type="dxa"/>
+              <w:bottom w:w="240" w:type="dxa"/>
+              <w:right w:w="180" w:type="dxa"/>
+            </w:tcMar>
+            <w:vAlign w:val="center"/>
+            <w:hideMark/>
+          </w:tcPr>
+          <w:p>
+            <w:pPr>
+              <w:spacing w:after="0" w:line="240" w:lineRule="auto"/>
+              <w:rPr>
+                <w:rFonts w:ascii="Arial" w:eastAsia="Times New Roman" w:hAnsi="Arial" w:cs="Arial"/>
+                <w:color w:val="1F1F1F"/>
+                <w:kern w:val="0"/>
+                <w:lang w:eastAsia="en-IN"/>
+                <w14:ligatures w14:val="none"/>
+              </w:rPr>
+            </w:pPr>
+            <w:r>
+              <w:rPr>
+                <w:rFonts w:ascii="Arial" w:eastAsia="Times New Roman" w:hAnsi="Arial" w:cs="Arial"/>
+                <w:b/>
+                <w:bCs/>
+                <w:color w:val="1F1F1F"/>
+                <w:kern w:val="0"/>
+                <w:bdr w:val="none" w:sz="0" w:space="0" w:color="auto" w:frame="1"/>
+                <w:lang w:eastAsia="en-IN"/>
+                <w14:ligatures w14:val="none"/>
+              </w:rPr>
+              <w:t>Zero Ops.</w:t>
+            </w:r>
+          </w:p>
+        </w:tc>
+        <w:tc>
+          <w:tcPr>
+            <w:tcW w:w="1639" w:type="dxa"/>
+            <w:tcBorders>
+              <w:top w:val="single" w:sz="6" w:space="0" w:color="auto"/>
+              <w:left w:val="single" w:sz="6" w:space="0" w:color="auto"/>
+              <w:bottom w:val="single" w:sz="6" w:space="0" w:color="auto"/>
+              <w:right w:val="single" w:sz="6" w:space="0" w:color="auto"/>
+            </w:tcBorders>
+            <w:tcMar>
+              <w:top w:w="240" w:type="dxa"/>
+              <w:left w:w="0" w:type="dxa"/>
+              <w:bottom w:w="240" w:type="dxa"/>
+              <w:right w:w="180" w:type="dxa"/>
+            </w:tcMar>
+            <w:vAlign w:val="center"/>
+            <w:hideMark/>
+          </w:tcPr>
+          <w:p>
+            <w:pPr>
+              <w:spacing w:after="0" w:line="240" w:lineRule="auto"/>
+              <w:rPr>
+                <w:rFonts w:ascii="Arial" w:eastAsia="Times New Roman" w:hAnsi="Arial" w:cs="Arial"/>
+                <w:color w:val="1F1F1F"/>
+                <w:kern w:val="0"/>
+                <w:lang w:eastAsia="en-IN"/>
+                <w14:ligatures w14:val="none"/>
+              </w:rPr>
+            </w:pPr>
+            <w:r>
+              <w:rPr>
+                <w:rFonts w:ascii="Arial" w:eastAsia="Times New Roman" w:hAnsi="Arial" w:cs="Arial"/>
+                <w:b/>
+                <w:bCs/>
+                <w:color w:val="1F1F1F"/>
+                <w:kern w:val="0"/>
+                <w:bdr w:val="none" w:sz="0" w:space="0" w:color="auto" w:frame="1"/>
+                <w:lang w:eastAsia="en-IN"/>
+                <w14:ligatures w14:val="none"/>
+              </w:rPr>
+              <w:t>Filter Precision.</w:t>
+            </w:r>
+          </w:p>
+        </w:tc>
+        <w:tc>
+          <w:tcPr>
+            <w:tcW w:w="1602" w:type="dxa"/>
+            <w:tcBorders>
+              <w:top w:val="single" w:sz="6" w:space="0" w:color="auto"/>
+              <w:left w:val="single" w:sz="6" w:space="0" w:color="auto"/>
+              <w:bottom w:val="single" w:sz="6" w:space="0" w:color="auto"/>
+              <w:right w:val="single" w:sz="6" w:space="0" w:color="auto"/>
+            </w:tcBorders>
+            <w:tcMar>
+              <w:top w:w="240" w:type="dxa"/>
+              <w:left w:w="0" w:type="dxa"/>
+              <w:bottom w:w="240" w:type="dxa"/>
+              <w:right w:w="0" w:type="dxa"/>
+            </w:tcMar>
+            <w:vAlign w:val="center"/>
+            <w:hideMark/>
+          </w:tcPr>
+          <w:p>
+            <w:pPr>
+              <w:spacing w:after="0" w:line="240" w:lineRule="auto"/>
+              <w:rPr>
+                <w:rFonts w:ascii="Arial" w:eastAsia="Times New Roman" w:hAnsi="Arial" w:cs="Arial"/>
+                <w:color w:val="1F1F1F"/>
+                <w:kern w:val="0"/>
+                <w:lang w:eastAsia="en-IN"/>
+                <w14:ligatures w14:val="none"/>
+              </w:rPr>
+            </w:pPr>
+            <w:r>
+              <w:rPr>
+                <w:rFonts w:ascii="Arial" w:eastAsia="Times New Roman" w:hAnsi="Arial" w:cs="Arial"/>
+                <w:b/>
+                <w:bCs/>
+                <w:color w:val="1F1F1F"/>
+                <w:kern w:val="0"/>
+                <w:bdr w:val="none" w:sz="0" w:space="0" w:color="auto" w:frame="1"/>
+                <w:lang w:eastAsia="en-IN"/>
+                <w14:ligatures w14:val="none"/>
+              </w:rPr>
+              <w:t>Scale &amp; Durability.</w:t>
+            </w:r>
+          </w:p>
+        </w:tc>
+      </w:tr>
+    </w:tbl>
     <w:p/>
     <w:p>
       <w:pPr>
         <w:pStyle w:val="Heading1"/>
       </w:pPr>
       <w:r>
+        <w:t xml:space="preserve">STEP </w:t>
+      </w:r>
+      <w:r>
+        <w:t>4</w:t>
+      </w:r>
+      <w:r>
+        <w:t>: RETRIEVAL (Senior-Level Structured View)</w:t>
+      </w:r>
+    </w:p>
+    <w:p>
+      <w:pPr>
+        <w:pStyle w:val="Heading2"/>
+      </w:pPr>
+      <w:r>
+        <w:t>Query Processing Layer (Decision Point 1)</w:t>
+      </w:r>
+    </w:p>
+    <w:p>
+      <w:pPr>
+        <w:pStyle w:val="Heading3"/>
+      </w:pPr>
+      <w:r>
+        <w:t>Option A — Direct Query (Default)</w:t>
+      </w:r>
+    </w:p>
+    <w:p>
+      <w:r>
+        <w:t>Use when:</w:t>
+      </w:r>
+    </w:p>
+    <w:p>
+      <w:r>
         <w:lastRenderedPageBreak/>
-        <w:t xml:space="preserve">STEP </w:t>
-      </w:r>
-      <w:r>
-        <w:t>4</w:t>
-      </w:r>
-      <w:r>
-        <w:t>: RETRIEVAL (Senior-Level Structured View)</w:t>
-      </w:r>
-    </w:p>
+        <w:t>low latency required</w:t>
+      </w:r>
+      <w:r>
+        <w:br/>
+        <w:t>simple queries</w:t>
+      </w:r>
+    </w:p>
+    <w:p>
+      <w:pPr>
+        <w:pStyle w:val="Heading3"/>
+      </w:pPr>
+      <w:r>
+        <w:t>Option B — Query Rewriting (Advanced)</w:t>
+      </w:r>
+    </w:p>
+    <w:p>
+      <w:r>
+        <w:t>user query → LLM rewrite → embedding → retrieval</w:t>
+      </w:r>
+    </w:p>
+    <w:p>
+      <w:pPr>
+        <w:pStyle w:val="Heading3"/>
+      </w:pPr>
+      <w:r>
+        <w:t>Option C — Multi-Query Retrieval (Very Advanced)</w:t>
+      </w:r>
+    </w:p>
+    <w:p>
+      <w:r>
+        <w:t>1 query → multiple variations → multiple retrievals → merge</w:t>
+      </w:r>
+    </w:p>
+    <w:p/>
     <w:p>
       <w:pPr>
         <w:pStyle w:val="Heading2"/>
       </w:pPr>
       <w:r>
-        <w:t>Query Processing Layer (Decision Point 1)</w:t>
+        <w:t>Retrieval Strategy Layer</w:t>
       </w:r>
     </w:p>
     <w:p>
@@ -1443,21 +3813,24 @@
         <w:pStyle w:val="Heading3"/>
       </w:pPr>
       <w:r>
-        <w:t>Option A — Direct Query (Default)</w:t>
-      </w:r>
-    </w:p>
-    <w:p>
-      <w:r>
-        <w:t>Use when:</w:t>
-      </w:r>
-    </w:p>
-    <w:p>
-      <w:r>
-        <w:t>low latency required</w:t>
-      </w:r>
-      <w:r>
-        <w:br/>
-        <w:t>simple queries</w:t>
+        <w:t>A. Dense Retrieval (Vector Search)</w:t>
+      </w:r>
+    </w:p>
+    <w:p>
+      <w:proofErr w:type="gramStart"/>
+      <w:r>
+        <w:t>Uses::</w:t>
+      </w:r>
+      <w:proofErr w:type="gramEnd"/>
+    </w:p>
+    <w:p>
+      <w:r>
+        <w:t>cosine similarity</w:t>
+      </w:r>
+    </w:p>
+    <w:p>
+      <w:r>
+        <w:t>dot product</w:t>
       </w:r>
     </w:p>
     <w:p>
@@ -1465,25 +3838,31 @@
         <w:pStyle w:val="Heading3"/>
       </w:pPr>
       <w:r>
-        <w:t>Option B — Query Rewriting (Advanced)</w:t>
-      </w:r>
-    </w:p>
-    <w:p>
-      <w:r>
-        <w:t>user query → LLM rewrite → embedding → retrieval</w:t>
-      </w:r>
-    </w:p>
+        <w:t>B. Sparse Retrieval (Keyword Search)</w:t>
+      </w:r>
+    </w:p>
+    <w:p>
+      <w:r>
+        <w:t>Uses:</w:t>
+      </w:r>
+    </w:p>
+    <w:p>
+      <w:r>
+        <w:t>BM25</w:t>
+      </w:r>
+    </w:p>
+    <w:p/>
     <w:p>
       <w:pPr>
         <w:pStyle w:val="Heading3"/>
       </w:pPr>
       <w:r>
-        <w:t>Option C — Multi-Query Retrieval (Very Advanced)</w:t>
-      </w:r>
-    </w:p>
-    <w:p>
-      <w:r>
-        <w:t>1 query → multiple variations → multiple retrievals → merge</w:t>
+        <w:t>C. Hybrid Retrieval (Production Standard)</w:t>
+      </w:r>
+    </w:p>
+    <w:p>
+      <w:r>
+        <w:t>dense + sparse → merge results</w:t>
       </w:r>
     </w:p>
     <w:p/>
@@ -1492,7 +3871,95 @@
         <w:pStyle w:val="Heading2"/>
       </w:pPr>
       <w:r>
-        <w:t>Retrieval Strategy Layer</w:t>
+        <w:t>3</w:t>
+      </w:r>
+      <w:r>
+        <w:t xml:space="preserve"> Candidate Selection (</w:t>
+      </w:r>
+      <w:proofErr w:type="spellStart"/>
+      <w:r>
+        <w:t>top_k</w:t>
+      </w:r>
+      <w:proofErr w:type="spellEnd"/>
+      <w:r>
+        <w:t xml:space="preserve"> Strategy)</w:t>
+      </w:r>
+    </w:p>
+    <w:p>
+      <w:pPr>
+        <w:pStyle w:val="Heading2"/>
+      </w:pPr>
+      <w:r>
+        <w:t xml:space="preserve">4 </w:t>
+      </w:r>
+      <w:r>
+        <w:t>Reranking Layer (VERY IMPORTANT)</w:t>
+      </w:r>
+    </w:p>
+    <w:p/>
+    <w:p>
+      <w:pPr>
+        <w:pStyle w:val="Heading2"/>
+      </w:pPr>
+      <w:r>
+        <w:t xml:space="preserve">5 </w:t>
+      </w:r>
+      <w:r>
+        <w:t>Filtering Layer (Metadata Usage)</w:t>
+      </w:r>
+    </w:p>
+    <w:p>
+      <w:r>
+        <w:t>access control</w:t>
+      </w:r>
+    </w:p>
+    <w:p>
+      <w:r>
+        <w:t>domain filtering</w:t>
+      </w:r>
+    </w:p>
+    <w:p>
+      <w:r>
+        <w:t>time filtering</w:t>
+      </w:r>
+    </w:p>
+    <w:p>
+      <w:pPr>
+        <w:pStyle w:val="Heading2"/>
+      </w:pPr>
+      <w:r>
+        <w:t xml:space="preserve">6 </w:t>
+      </w:r>
+      <w:r>
+        <w:t>Context Construction Laye</w:t>
+      </w:r>
+      <w:r>
+        <w:t>r</w:t>
+      </w:r>
+    </w:p>
+    <w:p>
+      <w:r>
+        <w:t>deduplication</w:t>
+      </w:r>
+      <w:r>
+        <w:br/>
+        <w:t>ordering by relevance</w:t>
+      </w:r>
+      <w:r>
+        <w:br/>
+        <w:t>context trimming</w:t>
+      </w:r>
+    </w:p>
+    <w:p>
+      <w:pPr>
+        <w:pStyle w:val="Heading2"/>
+      </w:pPr>
+      <w:r>
+        <w:lastRenderedPageBreak/>
+        <w:t xml:space="preserve">7 </w:t>
+      </w:r>
+      <w:r>
+        <w:t>Advanced Retrieval Techniques (Senior-Level)</w:t>
       </w:r>
     </w:p>
     <w:p>
@@ -1500,24 +3967,27 @@
         <w:pStyle w:val="Heading3"/>
       </w:pPr>
       <w:r>
-        <w:t>A. Dense Retrieval (Vector Search)</w:t>
-      </w:r>
-    </w:p>
-    <w:p>
-      <w:proofErr w:type="gramStart"/>
-      <w:r>
-        <w:t>Uses::</w:t>
-      </w:r>
-      <w:proofErr w:type="gramEnd"/>
-    </w:p>
-    <w:p>
-      <w:r>
-        <w:t>cosine similarity</w:t>
-      </w:r>
-    </w:p>
-    <w:p>
-      <w:r>
-        <w:t>dot product</w:t>
+        <w:t>A. Context Compression</w:t>
+      </w:r>
+    </w:p>
+    <w:p>
+      <w:r>
+        <w:t>Problem:</w:t>
+      </w:r>
+    </w:p>
+    <w:p>
+      <w:r>
+        <w:t>too many tokens</w:t>
+      </w:r>
+    </w:p>
+    <w:p>
+      <w:r>
+        <w:t>Solution:</w:t>
+      </w:r>
+    </w:p>
+    <w:p>
+      <w:r>
+        <w:t>summarize retrieved chunks before sending to LLM</w:t>
       </w:r>
     </w:p>
     <w:p>
@@ -1525,51 +3995,74 @@
         <w:pStyle w:val="Heading3"/>
       </w:pPr>
       <w:r>
-        <w:t>B. Sparse Retrieval (Keyword Search)</w:t>
-      </w:r>
-    </w:p>
-    <w:p>
-      <w:r>
-        <w:t>Uses:</w:t>
-      </w:r>
-    </w:p>
-    <w:p>
-      <w:r>
-        <w:t>BM25</w:t>
+        <w:t>B. Multi-Hop Retrieval</w:t>
+      </w:r>
+    </w:p>
+    <w:p>
+      <w:r>
+        <w:t>Used for complex queries:</w:t>
+      </w:r>
+    </w:p>
+    <w:p>
+      <w:r>
+        <w:t>Q: "What did CEO say about revenue growth?"</w:t>
+      </w:r>
+    </w:p>
+    <w:p>
+      <w:r>
+        <w:t>Steps:</w:t>
+      </w:r>
+    </w:p>
+    <w:p>
+      <w:r>
+        <w:t>retrieve CEO speech</w:t>
+      </w:r>
+      <w:r>
+        <w:br/>
+        <w:t>↓</w:t>
+      </w:r>
+      <w:r>
+        <w:br/>
+        <w:t>retrieve revenue discussion</w:t>
+      </w:r>
+    </w:p>
+    <w:p>
+      <w:pPr>
+        <w:pStyle w:val="Heading3"/>
+      </w:pPr>
+      <w:r>
+        <w:t>C. Adaptive Retrieval</w:t>
+      </w:r>
+    </w:p>
+    <w:p>
+      <w:r>
+        <w:t>System decides:</w:t>
+      </w:r>
+    </w:p>
+    <w:p>
+      <w:r>
+        <w:t>simple query → small retrieval</w:t>
+      </w:r>
+      <w:r>
+        <w:br/>
+        <w:t>complex query → large retrieval</w:t>
       </w:r>
     </w:p>
     <w:p/>
     <w:p>
       <w:pPr>
-        <w:pStyle w:val="Heading3"/>
-      </w:pPr>
-      <w:r>
-        <w:t>C. Hybrid Retrieval (Production Standard)</w:t>
-      </w:r>
-    </w:p>
-    <w:p>
-      <w:r>
-        <w:t>dense + sparse → merge results</w:t>
-      </w:r>
-    </w:p>
-    <w:p/>
+        <w:pStyle w:val="Heading1"/>
+      </w:pPr>
+      <w:r>
+        <w:t>STEP 5: GENERATION (LLM Layer)</w:t>
+      </w:r>
+    </w:p>
     <w:p>
       <w:pPr>
         <w:pStyle w:val="Heading2"/>
       </w:pPr>
       <w:r>
-        <w:t>3</w:t>
-      </w:r>
-      <w:r>
-        <w:t xml:space="preserve"> Candidate Selection (</w:t>
-      </w:r>
-      <w:proofErr w:type="spellStart"/>
-      <w:r>
-        <w:t>top_k</w:t>
-      </w:r>
-      <w:proofErr w:type="spellEnd"/>
-      <w:r>
-        <w:t xml:space="preserve"> Strategy)</w:t>
+        <w:t>Input Construction (VERY IMPORTANT)</w:t>
       </w:r>
     </w:p>
     <w:p>
@@ -1577,37 +4070,24 @@
         <w:pStyle w:val="Heading2"/>
       </w:pPr>
       <w:r>
-        <w:t xml:space="preserve">4 </w:t>
-      </w:r>
-      <w:r>
-        <w:t>Reranking Layer (VERY IMPORTANT)</w:t>
-      </w:r>
-    </w:p>
-    <w:p/>
+        <w:t>2️</w:t>
+      </w:r>
+      <w:r>
+        <w:rPr>
+          <w:rFonts w:ascii="Segoe UI Symbol" w:hAnsi="Segoe UI Symbol" w:cs="Segoe UI Symbol"/>
+        </w:rPr>
+        <w:t>⃣</w:t>
+      </w:r>
+      <w:r>
+        <w:t xml:space="preserve"> Prompt Engineering (Core Decision Layer)</w:t>
+      </w:r>
+    </w:p>
     <w:p>
       <w:pPr>
         <w:pStyle w:val="Heading2"/>
       </w:pPr>
       <w:r>
-        <w:t xml:space="preserve">5 </w:t>
-      </w:r>
-      <w:r>
-        <w:t>Filtering Layer (Metadata Usage)</w:t>
-      </w:r>
-    </w:p>
-    <w:p>
-      <w:r>
-        <w:t>access control</w:t>
-      </w:r>
-    </w:p>
-    <w:p>
-      <w:r>
-        <w:t>domain filtering</w:t>
-      </w:r>
-    </w:p>
-    <w:p>
-      <w:r>
-        <w:t>time filtering</w:t>
+        <w:t>C. Chain-of-Thought Prompt (Advanced)</w:t>
       </w:r>
     </w:p>
     <w:p>
@@ -1615,27 +4095,22 @@
         <w:pStyle w:val="Heading2"/>
       </w:pPr>
       <w:r>
-        <w:lastRenderedPageBreak/>
-        <w:t xml:space="preserve">6 </w:t>
-      </w:r>
-      <w:r>
-        <w:t>Context Construction Laye</w:t>
-      </w:r>
-      <w:r>
-        <w:t>r</w:t>
-      </w:r>
-    </w:p>
-    <w:p>
-      <w:r>
-        <w:t>deduplication</w:t>
-      </w:r>
-      <w:r>
-        <w:br/>
-        <w:t>ordering by relevance</w:t>
-      </w:r>
-      <w:r>
-        <w:br/>
-        <w:t>context trimming</w:t>
+        <w:t>Context Window Management (Critical)</w:t>
+      </w:r>
+    </w:p>
+    <w:p>
+      <w:r>
+        <w:t>A. Top-K trimming</w:t>
+      </w:r>
+    </w:p>
+    <w:p>
+      <w:r>
+        <w:t>B. Context compression</w:t>
+      </w:r>
+    </w:p>
+    <w:p>
+      <w:r>
+        <w:t>C. Sliding window (advanced)</w:t>
       </w:r>
     </w:p>
     <w:p>
@@ -1643,169 +4118,6 @@
         <w:pStyle w:val="Heading2"/>
       </w:pPr>
       <w:r>
-        <w:t xml:space="preserve">7 </w:t>
-      </w:r>
-      <w:r>
-        <w:t>Advanced Retrieval Techniques (Senior-Level)</w:t>
-      </w:r>
-    </w:p>
-    <w:p>
-      <w:pPr>
-        <w:pStyle w:val="Heading3"/>
-      </w:pPr>
-      <w:r>
-        <w:t>A. Context Compression</w:t>
-      </w:r>
-    </w:p>
-    <w:p>
-      <w:r>
-        <w:t>Problem:</w:t>
-      </w:r>
-    </w:p>
-    <w:p>
-      <w:r>
-        <w:t>too many tokens</w:t>
-      </w:r>
-    </w:p>
-    <w:p>
-      <w:r>
-        <w:t>Solution:</w:t>
-      </w:r>
-    </w:p>
-    <w:p>
-      <w:r>
-        <w:t>summarize retrieved chunks before sending to LLM</w:t>
-      </w:r>
-    </w:p>
-    <w:p>
-      <w:pPr>
-        <w:pStyle w:val="Heading3"/>
-      </w:pPr>
-      <w:r>
-        <w:t>B. Multi-Hop Retrieval</w:t>
-      </w:r>
-    </w:p>
-    <w:p>
-      <w:r>
-        <w:t>Used for complex queries:</w:t>
-      </w:r>
-    </w:p>
-    <w:p>
-      <w:r>
-        <w:t>Q: "What did CEO say about revenue growth?"</w:t>
-      </w:r>
-    </w:p>
-    <w:p>
-      <w:r>
-        <w:t>Steps:</w:t>
-      </w:r>
-    </w:p>
-    <w:p>
-      <w:r>
-        <w:t>retrieve CEO speech</w:t>
-      </w:r>
-      <w:r>
-        <w:br/>
-        <w:t>↓</w:t>
-      </w:r>
-      <w:r>
-        <w:br/>
-        <w:t>retrieve revenue discussion</w:t>
-      </w:r>
-    </w:p>
-    <w:p>
-      <w:pPr>
-        <w:pStyle w:val="Heading3"/>
-      </w:pPr>
-      <w:r>
-        <w:t>C. Adaptive Retrieval</w:t>
-      </w:r>
-    </w:p>
-    <w:p>
-      <w:r>
-        <w:t>System decides:</w:t>
-      </w:r>
-    </w:p>
-    <w:p>
-      <w:r>
-        <w:t>simple query → small retrieval</w:t>
-      </w:r>
-      <w:r>
-        <w:br/>
-        <w:t>complex query → large retrieval</w:t>
-      </w:r>
-    </w:p>
-    <w:p/>
-    <w:p>
-      <w:pPr>
-        <w:pStyle w:val="Heading1"/>
-      </w:pPr>
-      <w:r>
-        <w:t>STEP 5: GENERATION (LLM Layer)</w:t>
-      </w:r>
-    </w:p>
-    <w:p>
-      <w:pPr>
-        <w:pStyle w:val="Heading2"/>
-      </w:pPr>
-      <w:r>
-        <w:t>Input Construction (VERY IMPORTANT)</w:t>
-      </w:r>
-    </w:p>
-    <w:p>
-      <w:pPr>
-        <w:pStyle w:val="Heading2"/>
-      </w:pPr>
-      <w:r>
-        <w:t>2️</w:t>
-      </w:r>
-      <w:r>
-        <w:rPr>
-          <w:rFonts w:ascii="Segoe UI Symbol" w:hAnsi="Segoe UI Symbol" w:cs="Segoe UI Symbol"/>
-        </w:rPr>
-        <w:t>⃣</w:t>
-      </w:r>
-      <w:r>
-        <w:t xml:space="preserve"> Prompt Engineering (Core Decision Layer)</w:t>
-      </w:r>
-    </w:p>
-    <w:p>
-      <w:pPr>
-        <w:pStyle w:val="Heading2"/>
-      </w:pPr>
-      <w:r>
-        <w:t>C. Chain-of-Thought Prompt (Advanced)</w:t>
-      </w:r>
-    </w:p>
-    <w:p>
-      <w:pPr>
-        <w:pStyle w:val="Heading2"/>
-      </w:pPr>
-      <w:r>
-        <w:t>Context Window Management (Critical)</w:t>
-      </w:r>
-    </w:p>
-    <w:p>
-      <w:r>
-        <w:t>A. Top-K trimming</w:t>
-      </w:r>
-    </w:p>
-    <w:p>
-      <w:r>
-        <w:t>B. Context compression</w:t>
-      </w:r>
-    </w:p>
-    <w:p>
-      <w:r>
-        <w:t>C. Sliding window (advanced)</w:t>
-      </w:r>
-    </w:p>
-    <w:p>
-      <w:pPr>
-        <w:pStyle w:val="Heading2"/>
-      </w:pPr>
-      <w:r>
-        <w:lastRenderedPageBreak/>
         <w:t>4️</w:t>
       </w:r>
       <w:r>
@@ -1849,7 +4161,7 @@
     <w:p>
       <w:r>
         <w:pict w14:anchorId="23F4E625">
-          <v:rect id="_x0000_i1349" style="width:0;height:1.5pt" o:hralign="center" o:hrstd="t" o:hr="t" fillcolor="#a0a0a0" stroked="f"/>
+          <v:rect id="_x0000_i1025" style="width:0;height:1.5pt" o:hralign="center" o:hrstd="t" o:hr="t" fillcolor="#a0a0a0" stroked="f"/>
         </w:pict>
       </w:r>
     </w:p>
@@ -1884,7 +4196,7 @@
     <w:p>
       <w:r>
         <w:pict w14:anchorId="052DCFC5">
-          <v:rect id="_x0000_i1350" style="width:0;height:1.5pt" o:hralign="center" o:hrstd="t" o:hr="t" fillcolor="#a0a0a0" stroked="f"/>
+          <v:rect id="_x0000_i1026" style="width:0;height:1.5pt" o:hralign="center" o:hrstd="t" o:hr="t" fillcolor="#a0a0a0" stroked="f"/>
         </w:pict>
       </w:r>
     </w:p>
@@ -1908,7 +4220,7 @@
     <w:p>
       <w:r>
         <w:pict w14:anchorId="49886021">
-          <v:rect id="_x0000_i1351" style="width:0;height:1.5pt" o:hralign="center" o:hrstd="t" o:hr="t" fillcolor="#a0a0a0" stroked="f"/>
+          <v:rect id="_x0000_i1027" style="width:0;height:1.5pt" o:hralign="center" o:hrstd="t" o:hr="t" fillcolor="#a0a0a0" stroked="f"/>
         </w:pict>
       </w:r>
     </w:p>
@@ -1959,7 +4271,7 @@
     <w:p>
       <w:r>
         <w:pict w14:anchorId="0FDCA83C">
-          <v:rect id="_x0000_i1352" style="width:0;height:1.5pt" o:hralign="center" o:hrstd="t" o:hr="t" fillcolor="#a0a0a0" stroked="f"/>
+          <v:rect id="_x0000_i1028" style="width:0;height:1.5pt" o:hralign="center" o:hrstd="t" o:hr="t" fillcolor="#a0a0a0" stroked="f"/>
         </w:pict>
       </w:r>
     </w:p>
@@ -2021,7 +4333,7 @@
     <w:p>
       <w:r>
         <w:pict w14:anchorId="1F2EBBE6">
-          <v:rect id="_x0000_i1353" style="width:0;height:1.5pt" o:hralign="center" o:hrstd="t" o:hr="t" fillcolor="#a0a0a0" stroked="f"/>
+          <v:rect id="_x0000_i1029" style="width:0;height:1.5pt" o:hralign="center" o:hrstd="t" o:hr="t" fillcolor="#a0a0a0" stroked="f"/>
         </w:pict>
       </w:r>
     </w:p>
@@ -2090,18 +4402,214 @@
     </w:p>
     <w:p>
       <w:r>
+        <w:pict w14:anchorId="5EEB1F93">
+          <v:rect id="_x0000_i1030" style="width:0;height:1.5pt" o:hralign="center" o:hrstd="t" o:hr="t" fillcolor="#a0a0a0" stroked="f"/>
+        </w:pict>
+      </w:r>
+    </w:p>
+    <w:p>
+      <w:pPr>
+        <w:pStyle w:val="Heading3"/>
+      </w:pPr>
+      <w:r>
+        <w:t>2️</w:t>
+      </w:r>
+      <w:r>
+        <w:rPr>
+          <w:rFonts w:ascii="Segoe UI Symbol" w:hAnsi="Segoe UI Symbol" w:cs="Segoe UI Symbol"/>
+        </w:rPr>
+        <w:t>⃣</w:t>
+      </w:r>
+      <w:r>
+        <w:t xml:space="preserve"> Generation Evaluation</w:t>
+      </w:r>
+    </w:p>
+    <w:p>
+      <w:r>
+        <w:pict w14:anchorId="7D272D01">
+          <v:rect id="_x0000_i1031" style="width:0;height:1.5pt" o:hralign="center" o:hrstd="t" o:hr="t" fillcolor="#a0a0a0" stroked="f"/>
+        </w:pict>
+      </w:r>
+    </w:p>
+    <w:p>
+      <w:pPr>
+        <w:rPr>
+          <w:b/>
+          <w:bCs/>
+        </w:rPr>
+      </w:pPr>
+      <w:r>
+        <w:rPr>
+          <w:rFonts w:ascii="Segoe UI Emoji" w:hAnsi="Segoe UI Emoji" w:cs="Segoe UI Emoji"/>
+          <w:b/>
+          <w:bCs/>
+        </w:rPr>
         <w:lastRenderedPageBreak/>
-        <w:pict w14:anchorId="5EEB1F93">
-          <v:rect id="_x0000_i1354" style="width:0;height:1.5pt" o:hralign="center" o:hrstd="t" o:hr="t" fillcolor="#a0a0a0" stroked="f"/>
+        <w:t>🔹</w:t>
+      </w:r>
+      <w:r>
+        <w:rPr>
+          <w:b/>
+          <w:bCs/>
+        </w:rPr>
+        <w:t xml:space="preserve"> Faithfulness (VERY IMPORTANT)</w:t>
+      </w:r>
+    </w:p>
+    <w:p>
+      <w:r>
+        <w:t>Does the answer strictly come from retrieved context?</w:t>
+      </w:r>
+    </w:p>
+    <w:p>
+      <w:r>
+        <w:rPr>
+          <w:rFonts w:ascii="Segoe UI Emoji" w:hAnsi="Segoe UI Emoji" w:cs="Segoe UI Emoji"/>
+        </w:rPr>
+        <w:t>❌</w:t>
+      </w:r>
+      <w:r>
+        <w:t xml:space="preserve"> Bad:</w:t>
+      </w:r>
+    </w:p>
+    <w:p>
+      <w:r>
+        <w:t>LLM adds extra info not in context</w:t>
+      </w:r>
+    </w:p>
+    <w:p>
+      <w:r>
+        <w:rPr>
+          <w:rFonts w:ascii="Segoe UI Symbol" w:hAnsi="Segoe UI Symbol" w:cs="Segoe UI Symbol"/>
+        </w:rPr>
+        <w:t>✔</w:t>
+      </w:r>
+      <w:r>
+        <w:t xml:space="preserve"> Good:</w:t>
+      </w:r>
+    </w:p>
+    <w:p>
+      <w:r>
+        <w:t>Answer fully grounded in chunks</w:t>
+      </w:r>
+    </w:p>
+    <w:p>
+      <w:r>
+        <w:pict w14:anchorId="62F68110">
+          <v:rect id="_x0000_i1032" style="width:0;height:1.5pt" o:hralign="center" o:hrstd="t" o:hr="t" fillcolor="#a0a0a0" stroked="f"/>
         </w:pict>
       </w:r>
     </w:p>
     <w:p>
       <w:pPr>
+        <w:rPr>
+          <w:b/>
+          <w:bCs/>
+        </w:rPr>
+      </w:pPr>
+      <w:r>
+        <w:rPr>
+          <w:rFonts w:ascii="Segoe UI Emoji" w:hAnsi="Segoe UI Emoji" w:cs="Segoe UI Emoji"/>
+          <w:b/>
+          <w:bCs/>
+        </w:rPr>
+        <w:t>🔹</w:t>
+      </w:r>
+      <w:r>
+        <w:rPr>
+          <w:b/>
+          <w:bCs/>
+        </w:rPr>
+        <w:t xml:space="preserve"> Correctness</w:t>
+      </w:r>
+    </w:p>
+    <w:p>
+      <w:r>
+        <w:t>Is the answer factually correct?</w:t>
+      </w:r>
+    </w:p>
+    <w:p>
+      <w:r>
+        <w:pict w14:anchorId="25C22CD7">
+          <v:rect id="_x0000_i1033" style="width:0;height:1.5pt" o:hralign="center" o:hrstd="t" o:hr="t" fillcolor="#a0a0a0" stroked="f"/>
+        </w:pict>
+      </w:r>
+    </w:p>
+    <w:p>
+      <w:pPr>
+        <w:rPr>
+          <w:b/>
+          <w:bCs/>
+        </w:rPr>
+      </w:pPr>
+      <w:r>
+        <w:rPr>
+          <w:rFonts w:ascii="Segoe UI Emoji" w:hAnsi="Segoe UI Emoji" w:cs="Segoe UI Emoji"/>
+          <w:b/>
+          <w:bCs/>
+        </w:rPr>
+        <w:t>🔹</w:t>
+      </w:r>
+      <w:r>
+        <w:rPr>
+          <w:b/>
+          <w:bCs/>
+        </w:rPr>
+        <w:t xml:space="preserve"> Completeness</w:t>
+      </w:r>
+    </w:p>
+    <w:p>
+      <w:r>
+        <w:t>Does it fully answer the question?</w:t>
+      </w:r>
+    </w:p>
+    <w:p>
+      <w:r>
+        <w:pict w14:anchorId="253EE868">
+          <v:rect id="_x0000_i1034" style="width:0;height:1.5pt" o:hralign="center" o:hrstd="t" o:hr="t" fillcolor="#a0a0a0" stroked="f"/>
+        </w:pict>
+      </w:r>
+    </w:p>
+    <w:p>
+      <w:pPr>
+        <w:rPr>
+          <w:b/>
+          <w:bCs/>
+        </w:rPr>
+      </w:pPr>
+      <w:r>
+        <w:rPr>
+          <w:rFonts w:ascii="Segoe UI Emoji" w:hAnsi="Segoe UI Emoji" w:cs="Segoe UI Emoji"/>
+          <w:b/>
+          <w:bCs/>
+        </w:rPr>
+        <w:t>🔹</w:t>
+      </w:r>
+      <w:r>
+        <w:rPr>
+          <w:b/>
+          <w:bCs/>
+        </w:rPr>
+        <w:t xml:space="preserve"> Relevance</w:t>
+      </w:r>
+    </w:p>
+    <w:p>
+      <w:r>
+        <w:t>Is the answer actually related to the question?</w:t>
+      </w:r>
+    </w:p>
+    <w:p>
+      <w:r>
+        <w:pict w14:anchorId="7966AF60">
+          <v:rect id="_x0000_i1035" style="width:0;height:1.5pt" o:hralign="center" o:hrstd="t" o:hr="t" fillcolor="#a0a0a0" stroked="f"/>
+        </w:pict>
+      </w:r>
+    </w:p>
+    <w:p>
+      <w:pPr>
         <w:pStyle w:val="Heading3"/>
       </w:pPr>
       <w:r>
-        <w:t>2️</w:t>
+        <w:t>3️</w:t>
       </w:r>
       <w:r>
         <w:rPr>
@@ -2110,209 +4618,13 @@
         <w:t>⃣</w:t>
       </w:r>
       <w:r>
-        <w:t xml:space="preserve"> Generation Evaluation</w:t>
-      </w:r>
-    </w:p>
-    <w:p>
-      <w:r>
-        <w:pict w14:anchorId="7D272D01">
-          <v:rect id="_x0000_i1355" style="width:0;height:1.5pt" o:hralign="center" o:hrstd="t" o:hr="t" fillcolor="#a0a0a0" stroked="f"/>
-        </w:pict>
-      </w:r>
-    </w:p>
-    <w:p>
-      <w:pPr>
-        <w:rPr>
-          <w:b/>
-          <w:bCs/>
-        </w:rPr>
-      </w:pPr>
-      <w:r>
-        <w:rPr>
-          <w:rFonts w:ascii="Segoe UI Emoji" w:hAnsi="Segoe UI Emoji" w:cs="Segoe UI Emoji"/>
-          <w:b/>
-          <w:bCs/>
-        </w:rPr>
-        <w:t>🔹</w:t>
-      </w:r>
-      <w:r>
-        <w:rPr>
-          <w:b/>
-          <w:bCs/>
-        </w:rPr>
-        <w:t xml:space="preserve"> Faithfulness (VERY IMPORTANT)</w:t>
-      </w:r>
-    </w:p>
-    <w:p>
-      <w:r>
-        <w:t>Does the answer strictly come from retrieved context?</w:t>
-      </w:r>
-    </w:p>
-    <w:p>
-      <w:r>
-        <w:rPr>
-          <w:rFonts w:ascii="Segoe UI Emoji" w:hAnsi="Segoe UI Emoji" w:cs="Segoe UI Emoji"/>
-        </w:rPr>
-        <w:t>❌</w:t>
-      </w:r>
-      <w:r>
-        <w:t xml:space="preserve"> Bad:</w:t>
-      </w:r>
-    </w:p>
-    <w:p>
-      <w:r>
-        <w:t>LLM adds extra info not in context</w:t>
-      </w:r>
-    </w:p>
-    <w:p>
-      <w:r>
-        <w:rPr>
-          <w:rFonts w:ascii="Segoe UI Symbol" w:hAnsi="Segoe UI Symbol" w:cs="Segoe UI Symbol"/>
-        </w:rPr>
-        <w:t>✔</w:t>
-      </w:r>
-      <w:r>
-        <w:t xml:space="preserve"> Good:</w:t>
-      </w:r>
-    </w:p>
-    <w:p>
-      <w:r>
-        <w:t>Answer fully grounded in chunks</w:t>
-      </w:r>
-    </w:p>
-    <w:p>
-      <w:r>
-        <w:pict w14:anchorId="62F68110">
-          <v:rect id="_x0000_i1356" style="width:0;height:1.5pt" o:hralign="center" o:hrstd="t" o:hr="t" fillcolor="#a0a0a0" stroked="f"/>
-        </w:pict>
-      </w:r>
-    </w:p>
-    <w:p>
-      <w:pPr>
-        <w:rPr>
-          <w:b/>
-          <w:bCs/>
-        </w:rPr>
-      </w:pPr>
-      <w:r>
-        <w:rPr>
-          <w:rFonts w:ascii="Segoe UI Emoji" w:hAnsi="Segoe UI Emoji" w:cs="Segoe UI Emoji"/>
-          <w:b/>
-          <w:bCs/>
-        </w:rPr>
-        <w:t>🔹</w:t>
-      </w:r>
-      <w:r>
-        <w:rPr>
-          <w:b/>
-          <w:bCs/>
-        </w:rPr>
-        <w:t xml:space="preserve"> Correctness</w:t>
-      </w:r>
-    </w:p>
-    <w:p>
-      <w:r>
-        <w:t>Is the answer factually correct?</w:t>
-      </w:r>
-    </w:p>
-    <w:p>
-      <w:r>
-        <w:pict w14:anchorId="25C22CD7">
-          <v:rect id="_x0000_i1357" style="width:0;height:1.5pt" o:hralign="center" o:hrstd="t" o:hr="t" fillcolor="#a0a0a0" stroked="f"/>
-        </w:pict>
-      </w:r>
-    </w:p>
-    <w:p>
-      <w:pPr>
-        <w:rPr>
-          <w:b/>
-          <w:bCs/>
-        </w:rPr>
-      </w:pPr>
-      <w:r>
-        <w:rPr>
-          <w:rFonts w:ascii="Segoe UI Emoji" w:hAnsi="Segoe UI Emoji" w:cs="Segoe UI Emoji"/>
-          <w:b/>
-          <w:bCs/>
-        </w:rPr>
-        <w:t>🔹</w:t>
-      </w:r>
-      <w:r>
-        <w:rPr>
-          <w:b/>
-          <w:bCs/>
-        </w:rPr>
-        <w:t xml:space="preserve"> Completeness</w:t>
-      </w:r>
-    </w:p>
-    <w:p>
-      <w:r>
-        <w:t>Does it fully answer the question?</w:t>
-      </w:r>
-    </w:p>
-    <w:p>
-      <w:r>
-        <w:pict w14:anchorId="253EE868">
-          <v:rect id="_x0000_i1358" style="width:0;height:1.5pt" o:hralign="center" o:hrstd="t" o:hr="t" fillcolor="#a0a0a0" stroked="f"/>
-        </w:pict>
-      </w:r>
-    </w:p>
-    <w:p>
-      <w:pPr>
-        <w:rPr>
-          <w:b/>
-          <w:bCs/>
-        </w:rPr>
-      </w:pPr>
-      <w:r>
-        <w:rPr>
-          <w:rFonts w:ascii="Segoe UI Emoji" w:hAnsi="Segoe UI Emoji" w:cs="Segoe UI Emoji"/>
-          <w:b/>
-          <w:bCs/>
-        </w:rPr>
-        <w:t>🔹</w:t>
-      </w:r>
-      <w:r>
-        <w:rPr>
-          <w:b/>
-          <w:bCs/>
-        </w:rPr>
-        <w:t xml:space="preserve"> Relevance</w:t>
-      </w:r>
-    </w:p>
-    <w:p>
-      <w:r>
-        <w:t>Is the answer actually related to the question?</w:t>
-      </w:r>
-    </w:p>
-    <w:p>
-      <w:r>
-        <w:pict w14:anchorId="7966AF60">
-          <v:rect id="_x0000_i1359" style="width:0;height:1.5pt" o:hralign="center" o:hrstd="t" o:hr="t" fillcolor="#a0a0a0" stroked="f"/>
-        </w:pict>
-      </w:r>
-    </w:p>
-    <w:p>
-      <w:pPr>
-        <w:pStyle w:val="Heading3"/>
-      </w:pPr>
-      <w:r>
-        <w:t>3️</w:t>
-      </w:r>
-      <w:r>
-        <w:rPr>
-          <w:rFonts w:ascii="Segoe UI Symbol" w:hAnsi="Segoe UI Symbol" w:cs="Segoe UI Symbol"/>
-        </w:rPr>
-        <w:t>⃣</w:t>
-      </w:r>
-      <w:r>
         <w:t xml:space="preserve"> How to Evaluate (Without Tools)</w:t>
       </w:r>
     </w:p>
     <w:p>
       <w:r>
         <w:pict w14:anchorId="7362EEA8">
-          <v:rect id="_x0000_i1360" style="width:0;height:1.5pt" o:hralign="center" o:hrstd="t" o:hr="t" fillcolor="#a0a0a0" stroked="f"/>
+          <v:rect id="_x0000_i1036" style="width:0;height:1.5pt" o:hralign="center" o:hrstd="t" o:hr="t" fillcolor="#a0a0a0" stroked="f"/>
         </w:pict>
       </w:r>
     </w:p>
@@ -2378,7 +4690,7 @@
     <w:p>
       <w:r>
         <w:pict w14:anchorId="356A9BBE">
-          <v:rect id="_x0000_i1361" style="width:0;height:1.5pt" o:hralign="center" o:hrstd="t" o:hr="t" fillcolor="#a0a0a0" stroked="f"/>
+          <v:rect id="_x0000_i1037" style="width:0;height:1.5pt" o:hralign="center" o:hrstd="t" o:hr="t" fillcolor="#a0a0a0" stroked="f"/>
         </w:pict>
       </w:r>
     </w:p>
@@ -2399,18 +4711,53 @@
     </w:p>
     <w:p>
       <w:r>
+        <w:t>manual review</w:t>
+      </w:r>
+      <w:r>
+        <w:br/>
+        <w:t>gold dataset</w:t>
+      </w:r>
+    </w:p>
+    <w:p>
+      <w:r>
+        <w:pict w14:anchorId="55E5937A">
+          <v:rect id="_x0000_i1038" style="width:0;height:1.5pt" o:hralign="center" o:hrstd="t" o:hr="t" fillcolor="#a0a0a0" stroked="f"/>
+        </w:pict>
+      </w:r>
+    </w:p>
+    <w:p>
+      <w:pPr>
+        <w:rPr>
+          <w:b/>
+          <w:bCs/>
+        </w:rPr>
+      </w:pPr>
+      <w:r>
+        <w:rPr>
+          <w:b/>
+          <w:bCs/>
+        </w:rPr>
         <w:lastRenderedPageBreak/>
-        <w:t>manual review</w:t>
-      </w:r>
-      <w:r>
-        <w:br/>
-        <w:t>gold dataset</w:t>
-      </w:r>
-    </w:p>
-    <w:p>
-      <w:r>
-        <w:pict w14:anchorId="55E5937A">
-          <v:rect id="_x0000_i1362" style="width:0;height:1.5pt" o:hralign="center" o:hrstd="t" o:hr="t" fillcolor="#a0a0a0" stroked="f"/>
+        <w:t>C. Test Dataset</w:t>
+      </w:r>
+    </w:p>
+    <w:p>
+      <w:r>
+        <w:t>question</w:t>
+      </w:r>
+      <w:r>
+        <w:br/>
+        <w:t>expected answer</w:t>
+      </w:r>
+      <w:r>
+        <w:br/>
+        <w:t>expected document</w:t>
+      </w:r>
+    </w:p>
+    <w:p>
+      <w:r>
+        <w:pict w14:anchorId="635785C9">
+          <v:rect id="_x0000_i1039" style="width:0;height:1.5pt" o:hralign="center" o:hrstd="t" o:hr="t" fillcolor="#a0a0a0" stroked="f"/>
         </w:pict>
       </w:r>
     </w:p>
@@ -2426,107 +4773,153 @@
           <w:b/>
           <w:bCs/>
         </w:rPr>
-        <w:t>C. Test Dataset</w:t>
-      </w:r>
-    </w:p>
-    <w:p>
-      <w:r>
-        <w:t>question</w:t>
-      </w:r>
-      <w:r>
-        <w:br/>
-        <w:t>expected answer</w:t>
-      </w:r>
-      <w:r>
-        <w:br/>
-        <w:t>expected document</w:t>
-      </w:r>
-    </w:p>
-    <w:p>
-      <w:r>
-        <w:pict w14:anchorId="635785C9">
-          <v:rect id="_x0000_i1363" style="width:0;height:1.5pt" o:hralign="center" o:hrstd="t" o:hr="t" fillcolor="#a0a0a0" stroked="f"/>
+        <w:t>4️</w:t>
+      </w:r>
+      <w:r>
+        <w:rPr>
+          <w:rFonts w:ascii="Segoe UI Symbol" w:hAnsi="Segoe UI Symbol" w:cs="Segoe UI Symbol"/>
+          <w:b/>
+          <w:bCs/>
+        </w:rPr>
+        <w:t>⃣</w:t>
+      </w:r>
+      <w:r>
+        <w:rPr>
+          <w:b/>
+          <w:bCs/>
+        </w:rPr>
+        <w:t xml:space="preserve"> Evaluation Pipeline</w:t>
+      </w:r>
+    </w:p>
+    <w:p>
+      <w:r>
+        <w:t>Test Query</w:t>
+      </w:r>
+      <w:r>
+        <w:br/>
+        <w:t xml:space="preserve">   ↓</w:t>
+      </w:r>
+      <w:r>
+        <w:br/>
+        <w:t>Run RAG</w:t>
+      </w:r>
+      <w:r>
+        <w:br/>
+        <w:t xml:space="preserve">   ↓</w:t>
+      </w:r>
+      <w:r>
+        <w:br/>
+        <w:t>Compare with ground truth</w:t>
+      </w:r>
+      <w:r>
+        <w:br/>
+        <w:t xml:space="preserve">   ↓</w:t>
+      </w:r>
+      <w:r>
+        <w:br/>
+        <w:t>Score (recall, faithfulness, correctness)</w:t>
+      </w:r>
+    </w:p>
+    <w:p>
+      <w:r>
+        <w:pict w14:anchorId="2FB46163">
+          <v:rect id="_x0000_i1040" style="width:0;height:1.5pt" o:hralign="center" o:hrstd="t" o:hr="t" fillcolor="#a0a0a0" stroked="f"/>
         </w:pict>
       </w:r>
     </w:p>
     <w:p>
       <w:pPr>
-        <w:rPr>
-          <w:b/>
-          <w:bCs/>
-        </w:rPr>
-      </w:pPr>
-      <w:r>
-        <w:rPr>
-          <w:b/>
-          <w:bCs/>
-        </w:rPr>
-        <w:t>4️</w:t>
+        <w:pStyle w:val="Heading1"/>
+      </w:pPr>
+      <w:r>
+        <w:t>STEP 7: MONITORING + LOGGING (Production Observability)</w:t>
+      </w:r>
+    </w:p>
+    <w:p>
+      <w:r>
+        <w:pict w14:anchorId="3608E5FC">
+          <v:rect id="_x0000_i1041" style="width:0;height:1.5pt" o:hralign="center" o:hrstd="t" o:hr="t" fillcolor="#a0a0a0" stroked="f"/>
+        </w:pict>
+      </w:r>
+    </w:p>
+    <w:p>
+      <w:pPr>
+        <w:rPr>
+          <w:b/>
+          <w:bCs/>
+        </w:rPr>
+      </w:pPr>
+      <w:r>
+        <w:rPr>
+          <w:rFonts w:ascii="Segoe UI Emoji" w:hAnsi="Segoe UI Emoji" w:cs="Segoe UI Emoji"/>
+          <w:b/>
+          <w:bCs/>
+        </w:rPr>
+        <w:t>🎯</w:t>
+      </w:r>
+      <w:r>
+        <w:rPr>
+          <w:b/>
+          <w:bCs/>
+        </w:rPr>
+        <w:t xml:space="preserve"> Goal</w:t>
+      </w:r>
+    </w:p>
+    <w:p>
+      <w:r>
+        <w:t>Track system health, detect failures, improve performance</w:t>
+      </w:r>
+    </w:p>
+    <w:p>
+      <w:r>
+        <w:pict w14:anchorId="0E6BD848">
+          <v:rect id="_x0000_i1042" style="width:0;height:1.5pt" o:hralign="center" o:hrstd="t" o:hr="t" fillcolor="#a0a0a0" stroked="f"/>
+        </w:pict>
+      </w:r>
+    </w:p>
+    <w:p>
+      <w:pPr>
+        <w:pStyle w:val="Heading2"/>
+      </w:pPr>
+      <w:r>
+        <w:t>1️</w:t>
       </w:r>
       <w:r>
         <w:rPr>
           <w:rFonts w:ascii="Segoe UI Symbol" w:hAnsi="Segoe UI Symbol" w:cs="Segoe UI Symbol"/>
-          <w:b/>
-          <w:bCs/>
         </w:rPr>
         <w:t>⃣</w:t>
       </w:r>
       <w:r>
-        <w:rPr>
-          <w:b/>
-          <w:bCs/>
-        </w:rPr>
-        <w:t xml:space="preserve"> Evaluation Pipeline</w:t>
-      </w:r>
-    </w:p>
-    <w:p>
-      <w:r>
-        <w:t>Test Query</w:t>
-      </w:r>
-      <w:r>
-        <w:br/>
-        <w:t xml:space="preserve">   ↓</w:t>
-      </w:r>
-      <w:r>
-        <w:br/>
-        <w:t>Run RAG</w:t>
-      </w:r>
-      <w:r>
-        <w:br/>
-        <w:t xml:space="preserve">   ↓</w:t>
-      </w:r>
-      <w:r>
-        <w:br/>
-        <w:t>Compare with ground truth</w:t>
-      </w:r>
-      <w:r>
-        <w:br/>
-        <w:t xml:space="preserve">   ↓</w:t>
-      </w:r>
-      <w:r>
-        <w:br/>
-        <w:t>Score (recall, faithfulness, correctness)</w:t>
-      </w:r>
-    </w:p>
-    <w:p>
-      <w:r>
-        <w:pict w14:anchorId="2FB46163">
-          <v:rect id="_x0000_i1364" style="width:0;height:1.5pt" o:hralign="center" o:hrstd="t" o:hr="t" fillcolor="#a0a0a0" stroked="f"/>
+        <w:t xml:space="preserve"> What to Log (VERY IMPORTANT)</w:t>
+      </w:r>
+    </w:p>
+    <w:p>
+      <w:r>
+        <w:pict w14:anchorId="5A54EC90">
+          <v:rect id="_x0000_i1043" style="width:0;height:1.5pt" o:hralign="center" o:hrstd="t" o:hr="t" fillcolor="#a0a0a0" stroked="f"/>
         </w:pict>
       </w:r>
     </w:p>
     <w:p>
       <w:pPr>
-        <w:pStyle w:val="Heading1"/>
-      </w:pPr>
-      <w:r>
-        <w:t>STEP 7: MONITORING + LOGGING (Production Observability)</w:t>
-      </w:r>
-    </w:p>
-    <w:p>
-      <w:r>
-        <w:pict w14:anchorId="3608E5FC">
-          <v:rect id="_x0000_i1365" style="width:0;height:1.5pt" o:hralign="center" o:hrstd="t" o:hr="t" fillcolor="#a0a0a0" stroked="f"/>
+        <w:rPr>
+          <w:b/>
+          <w:bCs/>
+        </w:rPr>
+      </w:pPr>
+      <w:r>
+        <w:rPr>
+          <w:b/>
+          <w:bCs/>
+        </w:rPr>
+        <w:t>At EACH step</w:t>
+      </w:r>
+    </w:p>
+    <w:p>
+      <w:r>
+        <w:pict w14:anchorId="0704492D">
+          <v:rect id="_x0000_i1044" style="width:0;height:1.5pt" o:hralign="center" o:hrstd="t" o:hr="t" fillcolor="#a0a0a0" stroked="f"/>
         </w:pict>
       </w:r>
     </w:p>
@@ -2539,38 +4932,194 @@
       </w:pPr>
       <w:r>
         <w:rPr>
-          <w:rFonts w:ascii="Segoe UI Emoji" w:hAnsi="Segoe UI Emoji" w:cs="Segoe UI Emoji"/>
-          <w:b/>
-          <w:bCs/>
-        </w:rPr>
-        <w:t>🎯</w:t>
-      </w:r>
-      <w:r>
-        <w:rPr>
-          <w:b/>
-          <w:bCs/>
-        </w:rPr>
-        <w:t xml:space="preserve"> Goal</w:t>
-      </w:r>
-    </w:p>
-    <w:p>
-      <w:r>
-        <w:t>Track system health, detect failures, improve performance</w:t>
-      </w:r>
-    </w:p>
-    <w:p>
-      <w:r>
-        <w:pict w14:anchorId="0E6BD848">
-          <v:rect id="_x0000_i1366" style="width:0;height:1.5pt" o:hralign="center" o:hrstd="t" o:hr="t" fillcolor="#a0a0a0" stroked="f"/>
+          <w:b/>
+          <w:bCs/>
+        </w:rPr>
+        <w:t>A. Ingestion</w:t>
+      </w:r>
+    </w:p>
+    <w:p>
+      <w:r>
+        <w:t>documents processed</w:t>
+      </w:r>
+      <w:r>
+        <w:br/>
+        <w:t>chunk count</w:t>
+      </w:r>
+      <w:r>
+        <w:br/>
+        <w:t>errors</w:t>
+      </w:r>
+    </w:p>
+    <w:p>
+      <w:r>
+        <w:pict w14:anchorId="4A77F64C">
+          <v:rect id="_x0000_i1045" style="width:0;height:1.5pt" o:hralign="center" o:hrstd="t" o:hr="t" fillcolor="#a0a0a0" stroked="f"/>
         </w:pict>
       </w:r>
     </w:p>
     <w:p>
       <w:pPr>
+        <w:rPr>
+          <w:b/>
+          <w:bCs/>
+        </w:rPr>
+      </w:pPr>
+      <w:r>
+        <w:rPr>
+          <w:b/>
+          <w:bCs/>
+        </w:rPr>
+        <w:t>B. Embedding</w:t>
+      </w:r>
+    </w:p>
+    <w:p>
+      <w:r>
+        <w:t>embedding latency</w:t>
+      </w:r>
+      <w:r>
+        <w:br/>
+        <w:t>model used</w:t>
+      </w:r>
+      <w:r>
+        <w:br/>
+        <w:t>failures</w:t>
+      </w:r>
+    </w:p>
+    <w:p>
+      <w:r>
+        <w:pict w14:anchorId="7730AF3A">
+          <v:rect id="_x0000_i1046" style="width:0;height:1.5pt" o:hralign="center" o:hrstd="t" o:hr="t" fillcolor="#a0a0a0" stroked="f"/>
+        </w:pict>
+      </w:r>
+    </w:p>
+    <w:p>
+      <w:pPr>
+        <w:rPr>
+          <w:b/>
+          <w:bCs/>
+        </w:rPr>
+      </w:pPr>
+      <w:r>
+        <w:rPr>
+          <w:b/>
+          <w:bCs/>
+        </w:rPr>
+        <w:lastRenderedPageBreak/>
+        <w:t>C. Vector DB</w:t>
+      </w:r>
+    </w:p>
+    <w:p>
+      <w:r>
+        <w:t>query latency</w:t>
+      </w:r>
+      <w:r>
+        <w:br/>
+      </w:r>
+      <w:proofErr w:type="spellStart"/>
+      <w:r>
+        <w:t>top_k</w:t>
+      </w:r>
+      <w:proofErr w:type="spellEnd"/>
+      <w:r>
+        <w:t xml:space="preserve"> results</w:t>
+      </w:r>
+      <w:r>
+        <w:br/>
+        <w:t>index performance</w:t>
+      </w:r>
+    </w:p>
+    <w:p>
+      <w:r>
+        <w:pict w14:anchorId="21BF3A4F">
+          <v:rect id="_x0000_i1047" style="width:0;height:1.5pt" o:hralign="center" o:hrstd="t" o:hr="t" fillcolor="#a0a0a0" stroked="f"/>
+        </w:pict>
+      </w:r>
+    </w:p>
+    <w:p>
+      <w:pPr>
+        <w:rPr>
+          <w:b/>
+          <w:bCs/>
+        </w:rPr>
+      </w:pPr>
+      <w:r>
+        <w:rPr>
+          <w:b/>
+          <w:bCs/>
+        </w:rPr>
+        <w:t>D. Retrieval</w:t>
+      </w:r>
+    </w:p>
+    <w:p>
+      <w:r>
+        <w:t>query</w:t>
+      </w:r>
+      <w:r>
+        <w:br/>
+        <w:t>retrieved chunks</w:t>
+      </w:r>
+      <w:r>
+        <w:br/>
+        <w:t>scores</w:t>
+      </w:r>
+      <w:r>
+        <w:br/>
+        <w:t>metadata filters used</w:t>
+      </w:r>
+    </w:p>
+    <w:p>
+      <w:r>
+        <w:pict w14:anchorId="402CB474">
+          <v:rect id="_x0000_i1048" style="width:0;height:1.5pt" o:hralign="center" o:hrstd="t" o:hr="t" fillcolor="#a0a0a0" stroked="f"/>
+        </w:pict>
+      </w:r>
+    </w:p>
+    <w:p>
+      <w:pPr>
+        <w:rPr>
+          <w:b/>
+          <w:bCs/>
+        </w:rPr>
+      </w:pPr>
+      <w:r>
+        <w:rPr>
+          <w:b/>
+          <w:bCs/>
+        </w:rPr>
+        <w:t>E. Generation</w:t>
+      </w:r>
+    </w:p>
+    <w:p>
+      <w:r>
+        <w:t>prompt</w:t>
+      </w:r>
+      <w:r>
+        <w:br/>
+        <w:t>tokens used</w:t>
+      </w:r>
+      <w:r>
+        <w:br/>
+        <w:t>response time</w:t>
+      </w:r>
+      <w:r>
+        <w:br/>
+        <w:t>final answer</w:t>
+      </w:r>
+    </w:p>
+    <w:p>
+      <w:r>
+        <w:pict w14:anchorId="0E13921F">
+          <v:rect id="_x0000_i1049" style="width:0;height:1.5pt" o:hralign="center" o:hrstd="t" o:hr="t" fillcolor="#a0a0a0" stroked="f"/>
+        </w:pict>
+      </w:r>
+    </w:p>
+    <w:p>
+      <w:pPr>
         <w:pStyle w:val="Heading2"/>
       </w:pPr>
       <w:r>
-        <w:t>1️</w:t>
+        <w:t>2️</w:t>
       </w:r>
       <w:r>
         <w:rPr>
@@ -2579,13 +5128,13 @@
         <w:t>⃣</w:t>
       </w:r>
       <w:r>
-        <w:t xml:space="preserve"> What to Log (VERY IMPORTANT)</w:t>
-      </w:r>
-    </w:p>
-    <w:p>
-      <w:r>
-        <w:pict w14:anchorId="5A54EC90">
-          <v:rect id="_x0000_i1367" style="width:0;height:1.5pt" o:hralign="center" o:hrstd="t" o:hr="t" fillcolor="#a0a0a0" stroked="f"/>
+        <w:t xml:space="preserve"> Key Metrics to Monitor</w:t>
+      </w:r>
+    </w:p>
+    <w:p>
+      <w:r>
+        <w:pict w14:anchorId="1FD969C8">
+          <v:rect id="_x0000_i1050" style="width:0;height:1.5pt" o:hralign="center" o:hrstd="t" o:hr="t" fillcolor="#a0a0a0" stroked="f"/>
         </w:pict>
       </w:r>
     </w:p>
@@ -2601,13 +5150,26 @@
           <w:b/>
           <w:bCs/>
         </w:rPr>
-        <w:t>At EACH step</w:t>
-      </w:r>
-    </w:p>
-    <w:p>
-      <w:r>
-        <w:pict w14:anchorId="0704492D">
-          <v:rect id="_x0000_i1368" style="width:0;height:1.5pt" o:hralign="center" o:hrstd="t" o:hr="t" fillcolor="#a0a0a0" stroked="f"/>
+        <w:t>Performance</w:t>
+      </w:r>
+    </w:p>
+    <w:p>
+      <w:r>
+        <w:t>latency (end-to-end)</w:t>
+      </w:r>
+      <w:r>
+        <w:br/>
+        <w:t>throughput (requests/sec)</w:t>
+      </w:r>
+      <w:r>
+        <w:br/>
+        <w:t>token usage</w:t>
+      </w:r>
+    </w:p>
+    <w:p>
+      <w:r>
+        <w:pict w14:anchorId="72BBF22C">
+          <v:rect id="_x0000_i1051" style="width:0;height:1.5pt" o:hralign="center" o:hrstd="t" o:hr="t" fillcolor="#a0a0a0" stroked="f"/>
         </w:pict>
       </w:r>
     </w:p>
@@ -2623,26 +5185,26 @@
           <w:b/>
           <w:bCs/>
         </w:rPr>
-        <w:t>A. Ingestion</w:t>
-      </w:r>
-    </w:p>
-    <w:p>
-      <w:r>
-        <w:t>documents processed</w:t>
-      </w:r>
-      <w:r>
-        <w:br/>
-        <w:t>chunk count</w:t>
-      </w:r>
-      <w:r>
-        <w:br/>
-        <w:t>errors</w:t>
-      </w:r>
-    </w:p>
-    <w:p>
-      <w:r>
-        <w:pict w14:anchorId="4A77F64C">
-          <v:rect id="_x0000_i1369" style="width:0;height:1.5pt" o:hralign="center" o:hrstd="t" o:hr="t" fillcolor="#a0a0a0" stroked="f"/>
+        <w:t>Quality</w:t>
+      </w:r>
+    </w:p>
+    <w:p>
+      <w:r>
+        <w:t>retrieval success rate</w:t>
+      </w:r>
+      <w:r>
+        <w:br/>
+        <w:t>hallucination rate</w:t>
+      </w:r>
+      <w:r>
+        <w:br/>
+        <w:t>user feedback score</w:t>
+      </w:r>
+    </w:p>
+    <w:p>
+      <w:r>
+        <w:pict w14:anchorId="2F467DFE">
+          <v:rect id="_x0000_i1052" style="width:0;height:1.5pt" o:hralign="center" o:hrstd="t" o:hr="t" fillcolor="#a0a0a0" stroked="f"/>
         </w:pict>
       </w:r>
     </w:p>
@@ -2658,262 +5220,11 @@
           <w:b/>
           <w:bCs/>
         </w:rPr>
-        <w:t>B. Embedding</w:t>
-      </w:r>
-    </w:p>
-    <w:p>
-      <w:r>
-        <w:lastRenderedPageBreak/>
-        <w:t>embedding latency</w:t>
-      </w:r>
-      <w:r>
-        <w:br/>
-        <w:t>model used</w:t>
-      </w:r>
-      <w:r>
-        <w:br/>
-        <w:t>failures</w:t>
-      </w:r>
-    </w:p>
-    <w:p>
-      <w:r>
-        <w:pict w14:anchorId="7730AF3A">
-          <v:rect id="_x0000_i1370" style="width:0;height:1.5pt" o:hralign="center" o:hrstd="t" o:hr="t" fillcolor="#a0a0a0" stroked="f"/>
-        </w:pict>
-      </w:r>
-    </w:p>
-    <w:p>
-      <w:pPr>
-        <w:rPr>
-          <w:b/>
-          <w:bCs/>
-        </w:rPr>
-      </w:pPr>
-      <w:r>
-        <w:rPr>
-          <w:b/>
-          <w:bCs/>
-        </w:rPr>
-        <w:t>C. Vector DB</w:t>
-      </w:r>
-    </w:p>
-    <w:p>
-      <w:r>
-        <w:t>query latency</w:t>
-      </w:r>
-      <w:r>
-        <w:br/>
-      </w:r>
-      <w:proofErr w:type="spellStart"/>
-      <w:r>
-        <w:t>top_k</w:t>
-      </w:r>
-      <w:proofErr w:type="spellEnd"/>
-      <w:r>
-        <w:t xml:space="preserve"> results</w:t>
-      </w:r>
-      <w:r>
-        <w:br/>
-        <w:t>index performance</w:t>
-      </w:r>
-    </w:p>
-    <w:p>
-      <w:r>
-        <w:pict w14:anchorId="21BF3A4F">
-          <v:rect id="_x0000_i1371" style="width:0;height:1.5pt" o:hralign="center" o:hrstd="t" o:hr="t" fillcolor="#a0a0a0" stroked="f"/>
-        </w:pict>
-      </w:r>
-    </w:p>
-    <w:p>
-      <w:pPr>
-        <w:rPr>
-          <w:b/>
-          <w:bCs/>
-        </w:rPr>
-      </w:pPr>
-      <w:r>
-        <w:rPr>
-          <w:b/>
-          <w:bCs/>
-        </w:rPr>
-        <w:t>D. Retrieval</w:t>
-      </w:r>
-    </w:p>
-    <w:p>
-      <w:r>
-        <w:t>query</w:t>
-      </w:r>
-      <w:r>
-        <w:br/>
-        <w:t>retrieved chunks</w:t>
-      </w:r>
-      <w:r>
-        <w:br/>
-        <w:t>scores</w:t>
-      </w:r>
-      <w:r>
-        <w:br/>
-        <w:t>metadata filters used</w:t>
-      </w:r>
-    </w:p>
-    <w:p>
-      <w:r>
-        <w:pict w14:anchorId="402CB474">
-          <v:rect id="_x0000_i1372" style="width:0;height:1.5pt" o:hralign="center" o:hrstd="t" o:hr="t" fillcolor="#a0a0a0" stroked="f"/>
-        </w:pict>
-      </w:r>
-    </w:p>
-    <w:p>
-      <w:pPr>
-        <w:rPr>
-          <w:b/>
-          <w:bCs/>
-        </w:rPr>
-      </w:pPr>
-      <w:r>
-        <w:rPr>
-          <w:b/>
-          <w:bCs/>
-        </w:rPr>
-        <w:t>E. Generation</w:t>
-      </w:r>
-    </w:p>
-    <w:p>
-      <w:r>
-        <w:t>prompt</w:t>
-      </w:r>
-      <w:r>
-        <w:br/>
-        <w:t>tokens used</w:t>
-      </w:r>
-      <w:r>
-        <w:br/>
-        <w:t>response time</w:t>
-      </w:r>
-      <w:r>
-        <w:br/>
-        <w:t>final answer</w:t>
-      </w:r>
-    </w:p>
-    <w:p>
-      <w:r>
-        <w:pict w14:anchorId="0E13921F">
-          <v:rect id="_x0000_i1373" style="width:0;height:1.5pt" o:hralign="center" o:hrstd="t" o:hr="t" fillcolor="#a0a0a0" stroked="f"/>
-        </w:pict>
-      </w:r>
-    </w:p>
-    <w:p>
-      <w:pPr>
-        <w:pStyle w:val="Heading2"/>
-      </w:pPr>
-      <w:r>
-        <w:t>2️</w:t>
-      </w:r>
-      <w:r>
-        <w:rPr>
-          <w:rFonts w:ascii="Segoe UI Symbol" w:hAnsi="Segoe UI Symbol" w:cs="Segoe UI Symbol"/>
-        </w:rPr>
-        <w:t>⃣</w:t>
-      </w:r>
-      <w:r>
-        <w:t xml:space="preserve"> Key Metrics to Monitor</w:t>
-      </w:r>
-    </w:p>
-    <w:p>
-      <w:r>
-        <w:pict w14:anchorId="1FD969C8">
-          <v:rect id="_x0000_i1374" style="width:0;height:1.5pt" o:hralign="center" o:hrstd="t" o:hr="t" fillcolor="#a0a0a0" stroked="f"/>
-        </w:pict>
-      </w:r>
-    </w:p>
-    <w:p>
-      <w:pPr>
-        <w:rPr>
-          <w:b/>
-          <w:bCs/>
-        </w:rPr>
-      </w:pPr>
-      <w:r>
-        <w:rPr>
-          <w:b/>
-          <w:bCs/>
-        </w:rPr>
-        <w:t>Performance</w:t>
-      </w:r>
-    </w:p>
-    <w:p>
-      <w:r>
-        <w:t>latency (end-to-end)</w:t>
-      </w:r>
-      <w:r>
-        <w:br/>
-        <w:t>throughput (requests/sec)</w:t>
-      </w:r>
-      <w:r>
-        <w:br/>
-        <w:t>token usage</w:t>
-      </w:r>
-    </w:p>
-    <w:p>
-      <w:r>
-        <w:pict w14:anchorId="72BBF22C">
-          <v:rect id="_x0000_i1375" style="width:0;height:1.5pt" o:hralign="center" o:hrstd="t" o:hr="t" fillcolor="#a0a0a0" stroked="f"/>
-        </w:pict>
-      </w:r>
-    </w:p>
-    <w:p>
-      <w:pPr>
-        <w:rPr>
-          <w:b/>
-          <w:bCs/>
-        </w:rPr>
-      </w:pPr>
-      <w:r>
-        <w:rPr>
-          <w:b/>
-          <w:bCs/>
-        </w:rPr>
-        <w:t>Quality</w:t>
-      </w:r>
-    </w:p>
-    <w:p>
-      <w:r>
-        <w:t>retrieval success rate</w:t>
-      </w:r>
-      <w:r>
-        <w:br/>
-        <w:t>hallucination rate</w:t>
-      </w:r>
-      <w:r>
-        <w:br/>
-        <w:t>user feedback score</w:t>
-      </w:r>
-    </w:p>
-    <w:p>
-      <w:r>
-        <w:pict w14:anchorId="2F467DFE">
-          <v:rect id="_x0000_i1376" style="width:0;height:1.5pt" o:hralign="center" o:hrstd="t" o:hr="t" fillcolor="#a0a0a0" stroked="f"/>
-        </w:pict>
-      </w:r>
-    </w:p>
-    <w:p>
-      <w:pPr>
-        <w:rPr>
-          <w:b/>
-          <w:bCs/>
-        </w:rPr>
-      </w:pPr>
-      <w:r>
-        <w:rPr>
-          <w:b/>
-          <w:bCs/>
-        </w:rPr>
         <w:t>System Health</w:t>
       </w:r>
     </w:p>
     <w:p>
       <w:r>
-        <w:lastRenderedPageBreak/>
         <w:t>error rate</w:t>
       </w:r>
       <w:r>
@@ -2928,7 +5239,7 @@
     <w:p>
       <w:r>
         <w:pict w14:anchorId="3E5C446D">
-          <v:rect id="_x0000_i1377" style="width:0;height:1.5pt" o:hralign="center" o:hrstd="t" o:hr="t" fillcolor="#a0a0a0" stroked="f"/>
+          <v:rect id="_x0000_i1053" style="width:0;height:1.5pt" o:hralign="center" o:hrstd="t" o:hr="t" fillcolor="#a0a0a0" stroked="f"/>
         </w:pict>
       </w:r>
     </w:p>
@@ -2981,13 +5292,14 @@
         </w:numPr>
       </w:pPr>
       <w:r>
+        <w:lastRenderedPageBreak/>
         <w:t xml:space="preserve">Grafana </w:t>
       </w:r>
     </w:p>
     <w:p>
       <w:r>
         <w:pict w14:anchorId="74B9EA8D">
-          <v:rect id="_x0000_i1378" style="width:0;height:1.5pt" o:hralign="center" o:hrstd="t" o:hr="t" fillcolor="#a0a0a0" stroked="f"/>
+          <v:rect id="_x0000_i1054" style="width:0;height:1.5pt" o:hralign="center" o:hrstd="t" o:hr="t" fillcolor="#a0a0a0" stroked="f"/>
         </w:pict>
       </w:r>
     </w:p>
@@ -3061,7 +5373,7 @@
     <w:p>
       <w:r>
         <w:pict w14:anchorId="1B682513">
-          <v:rect id="_x0000_i1379" style="width:0;height:1.5pt" o:hralign="center" o:hrstd="t" o:hr="t" fillcolor="#a0a0a0" stroked="f"/>
+          <v:rect id="_x0000_i1055" style="width:0;height:1.5pt" o:hralign="center" o:hrstd="t" o:hr="t" fillcolor="#a0a0a0" stroked="f"/>
         </w:pict>
       </w:r>
     </w:p>
@@ -3076,7 +5388,7 @@
     <w:p>
       <w:r>
         <w:pict w14:anchorId="05631B81">
-          <v:rect id="_x0000_i1380" style="width:0;height:1.5pt" o:hralign="center" o:hrstd="t" o:hr="t" fillcolor="#a0a0a0" stroked="f"/>
+          <v:rect id="_x0000_i1056" style="width:0;height:1.5pt" o:hralign="center" o:hrstd="t" o:hr="t" fillcolor="#a0a0a0" stroked="f"/>
         </w:pict>
       </w:r>
     </w:p>
@@ -3111,7 +5423,7 @@
     <w:p>
       <w:r>
         <w:pict w14:anchorId="4622CFEC">
-          <v:rect id="_x0000_i1381" style="width:0;height:1.5pt" o:hralign="center" o:hrstd="t" o:hr="t" fillcolor="#a0a0a0" stroked="f"/>
+          <v:rect id="_x0000_i1057" style="width:0;height:1.5pt" o:hralign="center" o:hrstd="t" o:hr="t" fillcolor="#a0a0a0" stroked="f"/>
         </w:pict>
       </w:r>
     </w:p>
@@ -3135,7 +5447,7 @@
     <w:p>
       <w:r>
         <w:pict w14:anchorId="408F6315">
-          <v:rect id="_x0000_i1382" style="width:0;height:1.5pt" o:hralign="center" o:hrstd="t" o:hr="t" fillcolor="#a0a0a0" stroked="f"/>
+          <v:rect id="_x0000_i1058" style="width:0;height:1.5pt" o:hralign="center" o:hrstd="t" o:hr="t" fillcolor="#a0a0a0" stroked="f"/>
         </w:pict>
       </w:r>
     </w:p>
@@ -3170,7 +5482,7 @@
     <w:p>
       <w:r>
         <w:pict w14:anchorId="57D8E801">
-          <v:rect id="_x0000_i1383" style="width:0;height:1.5pt" o:hralign="center" o:hrstd="t" o:hr="t" fillcolor="#a0a0a0" stroked="f"/>
+          <v:rect id="_x0000_i1059" style="width:0;height:1.5pt" o:hralign="center" o:hrstd="t" o:hr="t" fillcolor="#a0a0a0" stroked="f"/>
         </w:pict>
       </w:r>
     </w:p>
@@ -3191,7 +5503,6 @@
     </w:p>
     <w:p>
       <w:r>
-        <w:lastRenderedPageBreak/>
         <w:t>validate format</w:t>
       </w:r>
       <w:r>
@@ -3206,7 +5517,7 @@
     <w:p>
       <w:r>
         <w:pict w14:anchorId="3749643A">
-          <v:rect id="_x0000_i1384" style="width:0;height:1.5pt" o:hralign="center" o:hrstd="t" o:hr="t" fillcolor="#a0a0a0" stroked="f"/>
+          <v:rect id="_x0000_i1060" style="width:0;height:1.5pt" o:hralign="center" o:hrstd="t" o:hr="t" fillcolor="#a0a0a0" stroked="f"/>
         </w:pict>
       </w:r>
     </w:p>
@@ -3239,7 +5550,7 @@
     <w:p>
       <w:r>
         <w:pict w14:anchorId="1596D433">
-          <v:rect id="_x0000_i1385" style="width:0;height:1.5pt" o:hralign="center" o:hrstd="t" o:hr="t" fillcolor="#a0a0a0" stroked="f"/>
+          <v:rect id="_x0000_i1061" style="width:0;height:1.5pt" o:hralign="center" o:hrstd="t" o:hr="t" fillcolor="#a0a0a0" stroked="f"/>
         </w:pict>
       </w:r>
     </w:p>
@@ -3248,6 +5559,7 @@
         <w:pStyle w:val="Heading2"/>
       </w:pPr>
       <w:r>
+        <w:lastRenderedPageBreak/>
         <w:t>2️</w:t>
       </w:r>
       <w:r>
@@ -3263,7 +5575,7 @@
     <w:p>
       <w:r>
         <w:pict w14:anchorId="565754CF">
-          <v:rect id="_x0000_i1386" style="width:0;height:1.5pt" o:hralign="center" o:hrstd="t" o:hr="t" fillcolor="#a0a0a0" stroked="f"/>
+          <v:rect id="_x0000_i1062" style="width:0;height:1.5pt" o:hralign="center" o:hrstd="t" o:hr="t" fillcolor="#a0a0a0" stroked="f"/>
         </w:pict>
       </w:r>
     </w:p>
@@ -3285,7 +5597,7 @@
     <w:p>
       <w:r>
         <w:pict w14:anchorId="6F5D7073">
-          <v:rect id="_x0000_i1387" style="width:0;height:1.5pt" o:hralign="center" o:hrstd="t" o:hr="t" fillcolor="#a0a0a0" stroked="f"/>
+          <v:rect id="_x0000_i1063" style="width:0;height:1.5pt" o:hralign="center" o:hrstd="t" o:hr="t" fillcolor="#a0a0a0" stroked="f"/>
         </w:pict>
       </w:r>
     </w:p>
@@ -3327,7 +5639,7 @@
     <w:p>
       <w:r>
         <w:pict w14:anchorId="6EAFD127">
-          <v:rect id="_x0000_i1388" style="width:0;height:1.5pt" o:hralign="center" o:hrstd="t" o:hr="t" fillcolor="#a0a0a0" stroked="f"/>
+          <v:rect id="_x0000_i1064" style="width:0;height:1.5pt" o:hralign="center" o:hrstd="t" o:hr="t" fillcolor="#a0a0a0" stroked="f"/>
         </w:pict>
       </w:r>
     </w:p>
@@ -3354,7 +5666,7 @@
     <w:p>
       <w:r>
         <w:pict w14:anchorId="69F7BC3A">
-          <v:rect id="_x0000_i1389" style="width:0;height:1.5pt" o:hralign="center" o:hrstd="t" o:hr="t" fillcolor="#a0a0a0" stroked="f"/>
+          <v:rect id="_x0000_i1065" style="width:0;height:1.5pt" o:hralign="center" o:hrstd="t" o:hr="t" fillcolor="#a0a0a0" stroked="f"/>
         </w:pict>
       </w:r>
     </w:p>
@@ -3381,7 +5693,7 @@
     <w:p>
       <w:r>
         <w:pict w14:anchorId="5FFCEF09">
-          <v:rect id="_x0000_i1390" style="width:0;height:1.5pt" o:hralign="center" o:hrstd="t" o:hr="t" fillcolor="#a0a0a0" stroked="f"/>
+          <v:rect id="_x0000_i1066" style="width:0;height:1.5pt" o:hralign="center" o:hrstd="t" o:hr="t" fillcolor="#a0a0a0" stroked="f"/>
         </w:pict>
       </w:r>
     </w:p>
@@ -3405,7 +5717,7 @@
     <w:p>
       <w:r>
         <w:pict w14:anchorId="056B10AD">
-          <v:rect id="_x0000_i1391" style="width:0;height:1.5pt" o:hralign="center" o:hrstd="t" o:hr="t" fillcolor="#a0a0a0" stroked="f"/>
+          <v:rect id="_x0000_i1067" style="width:0;height:1.5pt" o:hralign="center" o:hrstd="t" o:hr="t" fillcolor="#a0a0a0" stroked="f"/>
         </w:pict>
       </w:r>
     </w:p>
@@ -3432,7 +5744,7 @@
     <w:p>
       <w:r>
         <w:pict w14:anchorId="776B7F9B">
-          <v:rect id="_x0000_i1392" style="width:0;height:1.5pt" o:hralign="center" o:hrstd="t" o:hr="t" fillcolor="#a0a0a0" stroked="f"/>
+          <v:rect id="_x0000_i1068" style="width:0;height:1.5pt" o:hralign="center" o:hrstd="t" o:hr="t" fillcolor="#a0a0a0" stroked="f"/>
         </w:pict>
       </w:r>
     </w:p>
@@ -3454,7 +5766,7 @@
     <w:p>
       <w:r>
         <w:pict w14:anchorId="720B5770">
-          <v:rect id="_x0000_i1393" style="width:0;height:1.5pt" o:hralign="center" o:hrstd="t" o:hr="t" fillcolor="#a0a0a0" stroked="f"/>
+          <v:rect id="_x0000_i1069" style="width:0;height:1.5pt" o:hralign="center" o:hrstd="t" o:hr="t" fillcolor="#a0a0a0" stroked="f"/>
         </w:pict>
       </w:r>
     </w:p>
@@ -3481,7 +5793,7 @@
     <w:p>
       <w:r>
         <w:pict w14:anchorId="382666E3">
-          <v:rect id="_x0000_i1394" style="width:0;height:1.5pt" o:hralign="center" o:hrstd="t" o:hr="t" fillcolor="#a0a0a0" stroked="f"/>
+          <v:rect id="_x0000_i1070" style="width:0;height:1.5pt" o:hralign="center" o:hrstd="t" o:hr="t" fillcolor="#a0a0a0" stroked="f"/>
         </w:pict>
       </w:r>
     </w:p>
@@ -3502,14 +5814,72 @@
     </w:p>
     <w:p>
       <w:r>
+        <w:t>user questions change over time</w:t>
+      </w:r>
+    </w:p>
+    <w:p>
+      <w:r>
+        <w:pict w14:anchorId="3445EE67">
+          <v:rect id="_x0000_i1071" style="width:0;height:1.5pt" o:hralign="center" o:hrstd="t" o:hr="t" fillcolor="#a0a0a0" stroked="f"/>
+        </w:pict>
+      </w:r>
+    </w:p>
+    <w:p>
+      <w:pPr>
+        <w:rPr>
+          <w:b/>
+          <w:bCs/>
+        </w:rPr>
+      </w:pPr>
+      <w:r>
+        <w:rPr>
+          <w:b/>
+          <w:bCs/>
+        </w:rPr>
+        <w:t>C. Embedding Drift</w:t>
+      </w:r>
+    </w:p>
+    <w:p>
+      <w:r>
+        <w:t>embedding model updated → vectors mismatch</w:t>
+      </w:r>
+    </w:p>
+    <w:p>
+      <w:r>
+        <w:pict w14:anchorId="79D7BA62">
+          <v:rect id="_x0000_i1072" style="width:0;height:1.5pt" o:hralign="center" o:hrstd="t" o:hr="t" fillcolor="#a0a0a0" stroked="f"/>
+        </w:pict>
+      </w:r>
+    </w:p>
+    <w:p>
+      <w:pPr>
+        <w:rPr>
+          <w:b/>
+          <w:bCs/>
+        </w:rPr>
+      </w:pPr>
+      <w:r>
+        <w:rPr>
+          <w:b/>
+          <w:bCs/>
+        </w:rPr>
+        <w:t>Detection</w:t>
+      </w:r>
+    </w:p>
+    <w:p>
+      <w:r>
         <w:lastRenderedPageBreak/>
-        <w:t>user questions change over time</w:t>
-      </w:r>
-    </w:p>
-    <w:p>
-      <w:r>
-        <w:pict w14:anchorId="3445EE67">
-          <v:rect id="_x0000_i1395" style="width:0;height:1.5pt" o:hralign="center" o:hrstd="t" o:hr="t" fillcolor="#a0a0a0" stroked="f"/>
+        <w:t>drop in retrieval accuracy</w:t>
+      </w:r>
+      <w:r>
+        <w:br/>
+        <w:t>drop in user satisfaction</w:t>
+      </w:r>
+    </w:p>
+    <w:p>
+      <w:r>
+        <w:pict w14:anchorId="6416410D">
+          <v:rect id="_x0000_i1073" style="width:0;height:1.5pt" o:hralign="center" o:hrstd="t" o:hr="t" fillcolor="#a0a0a0" stroked="f"/>
         </w:pict>
       </w:r>
     </w:p>
@@ -3525,49 +5895,50 @@
           <w:b/>
           <w:bCs/>
         </w:rPr>
-        <w:t>C. Embedding Drift</w:t>
-      </w:r>
-    </w:p>
-    <w:p>
-      <w:r>
-        <w:t>embedding model updated → vectors mismatch</w:t>
-      </w:r>
-    </w:p>
-    <w:p>
-      <w:r>
-        <w:pict w14:anchorId="79D7BA62">
-          <v:rect id="_x0000_i1396" style="width:0;height:1.5pt" o:hralign="center" o:hrstd="t" o:hr="t" fillcolor="#a0a0a0" stroked="f"/>
+        <w:t>Solution</w:t>
+      </w:r>
+    </w:p>
+    <w:p>
+      <w:r>
+        <w:t>re-embed data</w:t>
+      </w:r>
+      <w:r>
+        <w:br/>
+        <w:t>rebuild index</w:t>
+      </w:r>
+      <w:r>
+        <w:br/>
+        <w:t>update prompts</w:t>
+      </w:r>
+    </w:p>
+    <w:p>
+      <w:r>
+        <w:pict w14:anchorId="44CA8EE0">
+          <v:rect id="_x0000_i1074" style="width:0;height:1.5pt" o:hralign="center" o:hrstd="t" o:hr="t" fillcolor="#a0a0a0" stroked="f"/>
         </w:pict>
       </w:r>
     </w:p>
     <w:p>
       <w:pPr>
-        <w:rPr>
-          <w:b/>
-          <w:bCs/>
-        </w:rPr>
-      </w:pPr>
-      <w:r>
-        <w:rPr>
-          <w:b/>
-          <w:bCs/>
-        </w:rPr>
-        <w:t>Detection</w:t>
-      </w:r>
-    </w:p>
-    <w:p>
-      <w:r>
-        <w:t>drop in retrieval accuracy</w:t>
-      </w:r>
-      <w:r>
-        <w:br/>
-        <w:t>drop in user satisfaction</w:t>
-      </w:r>
-    </w:p>
-    <w:p>
-      <w:r>
-        <w:pict w14:anchorId="6416410D">
-          <v:rect id="_x0000_i1397" style="width:0;height:1.5pt" o:hralign="center" o:hrstd="t" o:hr="t" fillcolor="#a0a0a0" stroked="f"/>
+        <w:pStyle w:val="Heading2"/>
+      </w:pPr>
+      <w:r>
+        <w:t>4️</w:t>
+      </w:r>
+      <w:r>
+        <w:rPr>
+          <w:rFonts w:ascii="Segoe UI Symbol" w:hAnsi="Segoe UI Symbol" w:cs="Segoe UI Symbol"/>
+        </w:rPr>
+        <w:t>⃣</w:t>
+      </w:r>
+      <w:r>
+        <w:t xml:space="preserve"> Security (Production Critical)</w:t>
+      </w:r>
+    </w:p>
+    <w:p>
+      <w:r>
+        <w:pict w14:anchorId="29D80A95">
+          <v:rect id="_x0000_i1075" style="width:0;height:1.5pt" o:hralign="center" o:hrstd="t" o:hr="t" fillcolor="#a0a0a0" stroked="f"/>
         </w:pict>
       </w:r>
     </w:p>
@@ -3583,50 +5954,49 @@
           <w:b/>
           <w:bCs/>
         </w:rPr>
-        <w:t>Solution</w:t>
-      </w:r>
-    </w:p>
-    <w:p>
-      <w:r>
-        <w:t>re-embed data</w:t>
-      </w:r>
-      <w:r>
-        <w:br/>
-        <w:t>rebuild index</w:t>
-      </w:r>
-      <w:r>
-        <w:br/>
-        <w:t>update prompts</w:t>
-      </w:r>
-    </w:p>
-    <w:p>
-      <w:r>
-        <w:pict w14:anchorId="44CA8EE0">
-          <v:rect id="_x0000_i1398" style="width:0;height:1.5pt" o:hralign="center" o:hrstd="t" o:hr="t" fillcolor="#a0a0a0" stroked="f"/>
+        <w:t>A. Access Control</w:t>
+      </w:r>
+    </w:p>
+    <w:p>
+      <w:r>
+        <w:t>user can only access allowed documents</w:t>
+      </w:r>
+    </w:p>
+    <w:p>
+      <w:r>
+        <w:pict w14:anchorId="601ABC7C">
+          <v:rect id="_x0000_i1076" style="width:0;height:1.5pt" o:hralign="center" o:hrstd="t" o:hr="t" fillcolor="#a0a0a0" stroked="f"/>
         </w:pict>
       </w:r>
     </w:p>
     <w:p>
       <w:pPr>
-        <w:pStyle w:val="Heading2"/>
-      </w:pPr>
-      <w:r>
-        <w:t>4️</w:t>
-      </w:r>
-      <w:r>
-        <w:rPr>
-          <w:rFonts w:ascii="Segoe UI Symbol" w:hAnsi="Segoe UI Symbol" w:cs="Segoe UI Symbol"/>
-        </w:rPr>
-        <w:t>⃣</w:t>
-      </w:r>
-      <w:r>
-        <w:t xml:space="preserve"> Security (Production Critical)</w:t>
-      </w:r>
-    </w:p>
-    <w:p>
-      <w:r>
-        <w:pict w14:anchorId="29D80A95">
-          <v:rect id="_x0000_i1399" style="width:0;height:1.5pt" o:hralign="center" o:hrstd="t" o:hr="t" fillcolor="#a0a0a0" stroked="f"/>
+        <w:rPr>
+          <w:b/>
+          <w:bCs/>
+        </w:rPr>
+      </w:pPr>
+      <w:r>
+        <w:rPr>
+          <w:b/>
+          <w:bCs/>
+        </w:rPr>
+        <w:t>B. Data Privacy</w:t>
+      </w:r>
+    </w:p>
+    <w:p>
+      <w:r>
+        <w:t>mask sensitive data</w:t>
+      </w:r>
+      <w:r>
+        <w:br/>
+        <w:t>encrypt storage</w:t>
+      </w:r>
+    </w:p>
+    <w:p>
+      <w:r>
+        <w:pict w14:anchorId="7CBDD063">
+          <v:rect id="_x0000_i1077" style="width:0;height:1.5pt" o:hralign="center" o:hrstd="t" o:hr="t" fillcolor="#a0a0a0" stroked="f"/>
         </w:pict>
       </w:r>
     </w:p>
@@ -3642,103 +6012,45 @@
           <w:b/>
           <w:bCs/>
         </w:rPr>
-        <w:t>A. Access Control</w:t>
-      </w:r>
-    </w:p>
-    <w:p>
-      <w:r>
-        <w:t>user can only access allowed documents</w:t>
-      </w:r>
-    </w:p>
-    <w:p>
-      <w:r>
-        <w:pict w14:anchorId="601ABC7C">
-          <v:rect id="_x0000_i1400" style="width:0;height:1.5pt" o:hralign="center" o:hrstd="t" o:hr="t" fillcolor="#a0a0a0" stroked="f"/>
+        <w:t>C. Prompt Injection Protection</w:t>
+      </w:r>
+    </w:p>
+    <w:p>
+      <w:r>
+        <w:t>ignore malicious instructions</w:t>
+      </w:r>
+    </w:p>
+    <w:p>
+      <w:r>
+        <w:t>Example:</w:t>
+      </w:r>
+    </w:p>
+    <w:p>
+      <w:r>
+        <w:t>"</w:t>
+      </w:r>
+      <w:proofErr w:type="gramStart"/>
+      <w:r>
+        <w:t>ignore</w:t>
+      </w:r>
+      <w:proofErr w:type="gramEnd"/>
+      <w:r>
+        <w:t xml:space="preserve"> previous instructions"</w:t>
+      </w:r>
+      <w:r>
+        <w:br/>
+        <w:t>→ block</w:t>
+      </w:r>
+    </w:p>
+    <w:p>
+      <w:r>
+        <w:pict w14:anchorId="18F06306">
+          <v:rect id="_x0000_i1078" style="width:0;height:1.5pt" o:hralign="center" o:hrstd="t" o:hr="t" fillcolor="#a0a0a0" stroked="f"/>
         </w:pict>
       </w:r>
     </w:p>
     <w:p>
       <w:pPr>
-        <w:rPr>
-          <w:b/>
-          <w:bCs/>
-        </w:rPr>
-      </w:pPr>
-      <w:r>
-        <w:rPr>
-          <w:b/>
-          <w:bCs/>
-        </w:rPr>
-        <w:t>B. Data Privacy</w:t>
-      </w:r>
-    </w:p>
-    <w:p>
-      <w:r>
-        <w:t>mask sensitive data</w:t>
-      </w:r>
-      <w:r>
-        <w:br/>
-        <w:t>encrypt storage</w:t>
-      </w:r>
-    </w:p>
-    <w:p>
-      <w:r>
-        <w:pict w14:anchorId="7CBDD063">
-          <v:rect id="_x0000_i1401" style="width:0;height:1.5pt" o:hralign="center" o:hrstd="t" o:hr="t" fillcolor="#a0a0a0" stroked="f"/>
-        </w:pict>
-      </w:r>
-    </w:p>
-    <w:p>
-      <w:pPr>
-        <w:rPr>
-          <w:b/>
-          <w:bCs/>
-        </w:rPr>
-      </w:pPr>
-      <w:r>
-        <w:rPr>
-          <w:b/>
-          <w:bCs/>
-        </w:rPr>
-        <w:t>C. Prompt Injection Protection</w:t>
-      </w:r>
-    </w:p>
-    <w:p>
-      <w:r>
-        <w:t>ignore malicious instructions</w:t>
-      </w:r>
-    </w:p>
-    <w:p>
-      <w:r>
-        <w:t>Example:</w:t>
-      </w:r>
-    </w:p>
-    <w:p>
-      <w:r>
-        <w:t>"</w:t>
-      </w:r>
-      <w:proofErr w:type="gramStart"/>
-      <w:r>
-        <w:t>ignore</w:t>
-      </w:r>
-      <w:proofErr w:type="gramEnd"/>
-      <w:r>
-        <w:t xml:space="preserve"> previous instructions"</w:t>
-      </w:r>
-      <w:r>
-        <w:br/>
-        <w:t>→ block</w:t>
-      </w:r>
-    </w:p>
-    <w:p>
-      <w:r>
-        <w:pict w14:anchorId="18F06306">
-          <v:rect id="_x0000_i1402" style="width:0;height:1.5pt" o:hralign="center" o:hrstd="t" o:hr="t" fillcolor="#a0a0a0" stroked="f"/>
-        </w:pict>
-      </w:r>
-    </w:p>
-    <w:p>
-      <w:pPr>
         <w:pStyle w:val="Heading1"/>
       </w:pPr>
       <w:r>
@@ -3761,9 +6073,6 @@
       </w:r>
       <w:r>
         <w:br/>
-      </w:r>
-      <w:r>
-        <w:lastRenderedPageBreak/>
         <w:t>3 Vector DB</w:t>
       </w:r>
       <w:r>

</xml_diff>